<commit_message>
Excel de control como fuente única y despliegue con ops.py
- config/control_plataforma.xlsx: parámetros, APIs, cuentas, permisos,
  usuarios, datasets, tablas, columnas y secretos; ops.py config genera
  tfvars, configuración y semillas de la API, con validación y --check en CI
- ops.py reemplaza Makefile/.env: bootstrap, plan, apply, datos, capas,
  api, verificar (BigQuery vs Excel), github, destroy, con log de tiempos
- Terraform parametrizado por el Excel; Cloud SQL, Cloud Run, WIF, DLQ
- Correcciones: publicadores esperan confirmación, Bronze con esquema
  explícito, Silver conserva fn/active, Gemini 3.1 Flash-Lite
- Documentos, matriz, calculadora y guía de despliegue actualizados

Co-Authored-By: Claude Opus 5.5 <noreply@anthropic.com>
Claude-Session: https://claude.ai/code/session_01MgiFcvhexL3jkhqY5yJgLS
</commit_message>
<xml_diff>
--- a/docs/entrega1/Entrega1_Arquitectura_BigData_Retail.docx
+++ b/docs/entrega1/Entrega1_Arquitectura_BigData_Retail.docx
@@ -1174,1021 +1174,6 @@
           </w:r>
         </w:p>
         <w:p>
-          <w:pPr>
-            <w:tabs>
-              <w:tab w:val="right" w:pos="9026" w:leader="dot"/>
-            </w:tabs>
-            <w:spacing w:after="40" w:before="100"/>
-            <w:ind w:left="0"/>
-          </w:pPr>
-          <w:r>
-            <w:rPr>
-              <w:rFonts w:ascii="Arial" w:cs="Arial" w:eastAsia="Arial" w:hAnsi="Arial"/>
-              <w:b/>
-              <w:bCs/>
-              <w:sz w:val="21"/>
-              <w:szCs w:val="21"/>
-            </w:rPr>
-            <w:t xml:space="preserve">1. Resumen ejecutivo</w:t>
-          </w:r>
-          <w:r>
-            <w:rPr>
-              <w:rFonts w:ascii="Arial" w:cs="Arial" w:eastAsia="Arial" w:hAnsi="Arial"/>
-              <w:b/>
-              <w:bCs/>
-              <w:sz w:val="21"/>
-              <w:szCs w:val="21"/>
-            </w:rPr>
-            <w:t xml:space="preserve">	4</w:t>
-          </w:r>
-        </w:p>
-        <w:p>
-          <w:pPr>
-            <w:tabs>
-              <w:tab w:val="right" w:pos="9026" w:leader="dot"/>
-            </w:tabs>
-            <w:spacing w:after="40" w:before="100"/>
-            <w:ind w:left="0"/>
-          </w:pPr>
-          <w:r>
-            <w:rPr>
-              <w:rFonts w:ascii="Arial" w:cs="Arial" w:eastAsia="Arial" w:hAnsi="Arial"/>
-              <w:b/>
-              <w:bCs/>
-              <w:sz w:val="21"/>
-              <w:szCs w:val="21"/>
-            </w:rPr>
-            <w:t xml:space="preserve">2. Contexto de negocio y alcance</w:t>
-          </w:r>
-          <w:r>
-            <w:rPr>
-              <w:rFonts w:ascii="Arial" w:cs="Arial" w:eastAsia="Arial" w:hAnsi="Arial"/>
-              <w:b/>
-              <w:bCs/>
-              <w:sz w:val="21"/>
-              <w:szCs w:val="21"/>
-            </w:rPr>
-            <w:t xml:space="preserve">	4</w:t>
-          </w:r>
-        </w:p>
-        <w:p>
-          <w:pPr>
-            <w:tabs>
-              <w:tab w:val="right" w:pos="9026" w:leader="dot"/>
-            </w:tabs>
-            <w:spacing w:after="40" w:before="0"/>
-            <w:ind w:left="360"/>
-          </w:pPr>
-          <w:r>
-            <w:rPr>
-              <w:rFonts w:ascii="Arial" w:cs="Arial" w:eastAsia="Arial" w:hAnsi="Arial"/>
-              <w:b w:val="false"/>
-              <w:bCs w:val="false"/>
-              <w:sz w:val="20"/>
-              <w:szCs w:val="20"/>
-            </w:rPr>
-            <w:t xml:space="preserve">2.1 Problema</w:t>
-          </w:r>
-          <w:r>
-            <w:rPr>
-              <w:rFonts w:ascii="Arial" w:cs="Arial" w:eastAsia="Arial" w:hAnsi="Arial"/>
-              <w:b w:val="false"/>
-              <w:bCs w:val="false"/>
-              <w:sz w:val="20"/>
-              <w:szCs w:val="20"/>
-            </w:rPr>
-            <w:t xml:space="preserve">	4</w:t>
-          </w:r>
-        </w:p>
-        <w:p>
-          <w:pPr>
-            <w:tabs>
-              <w:tab w:val="right" w:pos="9026" w:leader="dot"/>
-            </w:tabs>
-            <w:spacing w:after="40" w:before="0"/>
-            <w:ind w:left="360"/>
-          </w:pPr>
-          <w:r>
-            <w:rPr>
-              <w:rFonts w:ascii="Arial" w:cs="Arial" w:eastAsia="Arial" w:hAnsi="Arial"/>
-              <w:b w:val="false"/>
-              <w:bCs w:val="false"/>
-              <w:sz w:val="20"/>
-              <w:szCs w:val="20"/>
-            </w:rPr>
-            <w:t xml:space="preserve">2.2 Objetivos</w:t>
-          </w:r>
-          <w:r>
-            <w:rPr>
-              <w:rFonts w:ascii="Arial" w:cs="Arial" w:eastAsia="Arial" w:hAnsi="Arial"/>
-              <w:b w:val="false"/>
-              <w:bCs w:val="false"/>
-              <w:sz w:val="20"/>
-              <w:szCs w:val="20"/>
-            </w:rPr>
-            <w:t xml:space="preserve">	4</w:t>
-          </w:r>
-        </w:p>
-        <w:p>
-          <w:pPr>
-            <w:tabs>
-              <w:tab w:val="right" w:pos="9026" w:leader="dot"/>
-            </w:tabs>
-            <w:spacing w:after="40" w:before="0"/>
-            <w:ind w:left="360"/>
-          </w:pPr>
-          <w:r>
-            <w:rPr>
-              <w:rFonts w:ascii="Arial" w:cs="Arial" w:eastAsia="Arial" w:hAnsi="Arial"/>
-              <w:b w:val="false"/>
-              <w:bCs w:val="false"/>
-              <w:sz w:val="20"/>
-              <w:szCs w:val="20"/>
-            </w:rPr>
-            <w:t xml:space="preserve">2.3 Alcance y fuera de alcance</w:t>
-          </w:r>
-          <w:r>
-            <w:rPr>
-              <w:rFonts w:ascii="Arial" w:cs="Arial" w:eastAsia="Arial" w:hAnsi="Arial"/>
-              <w:b w:val="false"/>
-              <w:bCs w:val="false"/>
-              <w:sz w:val="20"/>
-              <w:szCs w:val="20"/>
-            </w:rPr>
-            <w:t xml:space="preserve">	5</w:t>
-          </w:r>
-        </w:p>
-        <w:p>
-          <w:pPr>
-            <w:tabs>
-              <w:tab w:val="right" w:pos="9026" w:leader="dot"/>
-            </w:tabs>
-            <w:spacing w:after="40" w:before="0"/>
-            <w:ind w:left="360"/>
-          </w:pPr>
-          <w:r>
-            <w:rPr>
-              <w:rFonts w:ascii="Arial" w:cs="Arial" w:eastAsia="Arial" w:hAnsi="Arial"/>
-              <w:b w:val="false"/>
-              <w:bCs w:val="false"/>
-              <w:sz w:val="20"/>
-              <w:szCs w:val="20"/>
-            </w:rPr>
-            <w:t xml:space="preserve">2.4 Supuestos</w:t>
-          </w:r>
-          <w:r>
-            <w:rPr>
-              <w:rFonts w:ascii="Arial" w:cs="Arial" w:eastAsia="Arial" w:hAnsi="Arial"/>
-              <w:b w:val="false"/>
-              <w:bCs w:val="false"/>
-              <w:sz w:val="20"/>
-              <w:szCs w:val="20"/>
-            </w:rPr>
-            <w:t xml:space="preserve">	5</w:t>
-          </w:r>
-        </w:p>
-        <w:p>
-          <w:pPr>
-            <w:tabs>
-              <w:tab w:val="right" w:pos="9026" w:leader="dot"/>
-            </w:tabs>
-            <w:spacing w:after="40" w:before="100"/>
-            <w:ind w:left="0"/>
-          </w:pPr>
-          <w:r>
-            <w:rPr>
-              <w:rFonts w:ascii="Arial" w:cs="Arial" w:eastAsia="Arial" w:hAnsi="Arial"/>
-              <w:b/>
-              <w:bCs/>
-              <w:sz w:val="21"/>
-              <w:szCs w:val="21"/>
-            </w:rPr>
-            <w:t xml:space="preserve">3. Equipo y roles</w:t>
-          </w:r>
-          <w:r>
-            <w:rPr>
-              <w:rFonts w:ascii="Arial" w:cs="Arial" w:eastAsia="Arial" w:hAnsi="Arial"/>
-              <w:b/>
-              <w:bCs/>
-              <w:sz w:val="21"/>
-              <w:szCs w:val="21"/>
-            </w:rPr>
-            <w:t xml:space="preserve">	5</w:t>
-          </w:r>
-        </w:p>
-        <w:p>
-          <w:pPr>
-            <w:tabs>
-              <w:tab w:val="right" w:pos="9026" w:leader="dot"/>
-            </w:tabs>
-            <w:spacing w:after="40" w:before="100"/>
-            <w:ind w:left="0"/>
-          </w:pPr>
-          <w:r>
-            <w:rPr>
-              <w:rFonts w:ascii="Arial" w:cs="Arial" w:eastAsia="Arial" w:hAnsi="Arial"/>
-              <w:b/>
-              <w:bCs/>
-              <w:sz w:val="21"/>
-              <w:szCs w:val="21"/>
-            </w:rPr>
-            <w:t xml:space="preserve">4. Inventario y perfil de datos</w:t>
-          </w:r>
-          <w:r>
-            <w:rPr>
-              <w:rFonts w:ascii="Arial" w:cs="Arial" w:eastAsia="Arial" w:hAnsi="Arial"/>
-              <w:b/>
-              <w:bCs/>
-              <w:sz w:val="21"/>
-              <w:szCs w:val="21"/>
-            </w:rPr>
-            <w:t xml:space="preserve">	6</w:t>
-          </w:r>
-        </w:p>
-        <w:p>
-          <w:pPr>
-            <w:tabs>
-              <w:tab w:val="right" w:pos="9026" w:leader="dot"/>
-            </w:tabs>
-            <w:spacing w:after="40" w:before="0"/>
-            <w:ind w:left="360"/>
-          </w:pPr>
-          <w:r>
-            <w:rPr>
-              <w:rFonts w:ascii="Arial" w:cs="Arial" w:eastAsia="Arial" w:hAnsi="Arial"/>
-              <w:b w:val="false"/>
-              <w:bCs w:val="false"/>
-              <w:sz w:val="20"/>
-              <w:szCs w:val="20"/>
-            </w:rPr>
-            <w:t xml:space="preserve">4.1 Hallazgos de calidad</w:t>
-          </w:r>
-          <w:r>
-            <w:rPr>
-              <w:rFonts w:ascii="Arial" w:cs="Arial" w:eastAsia="Arial" w:hAnsi="Arial"/>
-              <w:b w:val="false"/>
-              <w:bCs w:val="false"/>
-              <w:sz w:val="20"/>
-              <w:szCs w:val="20"/>
-            </w:rPr>
-            <w:t xml:space="preserve">	6</w:t>
-          </w:r>
-        </w:p>
-        <w:p>
-          <w:pPr>
-            <w:tabs>
-              <w:tab w:val="right" w:pos="9026" w:leader="dot"/>
-            </w:tabs>
-            <w:spacing w:after="40" w:before="0"/>
-            <w:ind w:left="360"/>
-          </w:pPr>
-          <w:r>
-            <w:rPr>
-              <w:rFonts w:ascii="Arial" w:cs="Arial" w:eastAsia="Arial" w:hAnsi="Arial"/>
-              <w:b w:val="false"/>
-              <w:bCs w:val="false"/>
-              <w:sz w:val="20"/>
-              <w:szCs w:val="20"/>
-            </w:rPr>
-            <w:t xml:space="preserve">4.2 Patrones de negocio útiles para el diseño</w:t>
-          </w:r>
-          <w:r>
-            <w:rPr>
-              <w:rFonts w:ascii="Arial" w:cs="Arial" w:eastAsia="Arial" w:hAnsi="Arial"/>
-              <w:b w:val="false"/>
-              <w:bCs w:val="false"/>
-              <w:sz w:val="20"/>
-              <w:szCs w:val="20"/>
-            </w:rPr>
-            <w:t xml:space="preserve">	6</w:t>
-          </w:r>
-        </w:p>
-        <w:p>
-          <w:pPr>
-            <w:tabs>
-              <w:tab w:val="right" w:pos="9026" w:leader="dot"/>
-            </w:tabs>
-            <w:spacing w:after="40" w:before="0"/>
-            <w:ind w:left="360"/>
-          </w:pPr>
-          <w:r>
-            <w:rPr>
-              <w:rFonts w:ascii="Arial" w:cs="Arial" w:eastAsia="Arial" w:hAnsi="Arial"/>
-              <w:b w:val="false"/>
-              <w:bCs w:val="false"/>
-              <w:sz w:val="20"/>
-              <w:szCs w:val="20"/>
-            </w:rPr>
-            <w:t xml:space="preserve">4.3 Decisión sobre la fuente Amazon Reviews 2023</w:t>
-          </w:r>
-          <w:r>
-            <w:rPr>
-              <w:rFonts w:ascii="Arial" w:cs="Arial" w:eastAsia="Arial" w:hAnsi="Arial"/>
-              <w:b w:val="false"/>
-              <w:bCs w:val="false"/>
-              <w:sz w:val="20"/>
-              <w:szCs w:val="20"/>
-            </w:rPr>
-            <w:t xml:space="preserve">	6</w:t>
-          </w:r>
-        </w:p>
-        <w:p>
-          <w:pPr>
-            <w:tabs>
-              <w:tab w:val="right" w:pos="9026" w:leader="dot"/>
-            </w:tabs>
-            <w:spacing w:after="40" w:before="100"/>
-            <w:ind w:left="0"/>
-          </w:pPr>
-          <w:r>
-            <w:rPr>
-              <w:rFonts w:ascii="Arial" w:cs="Arial" w:eastAsia="Arial" w:hAnsi="Arial"/>
-              <w:b/>
-              <w:bCs/>
-              <w:sz w:val="21"/>
-              <w:szCs w:val="21"/>
-            </w:rPr>
-            <w:t xml:space="preserve">5. Stack tecnológico y justificación</w:t>
-          </w:r>
-          <w:r>
-            <w:rPr>
-              <w:rFonts w:ascii="Arial" w:cs="Arial" w:eastAsia="Arial" w:hAnsi="Arial"/>
-              <w:b/>
-              <w:bCs/>
-              <w:sz w:val="21"/>
-              <w:szCs w:val="21"/>
-            </w:rPr>
-            <w:t xml:space="preserve">	7</w:t>
-          </w:r>
-        </w:p>
-        <w:p>
-          <w:pPr>
-            <w:tabs>
-              <w:tab w:val="right" w:pos="9026" w:leader="dot"/>
-            </w:tabs>
-            <w:spacing w:after="40" w:before="100"/>
-            <w:ind w:left="0"/>
-          </w:pPr>
-          <w:r>
-            <w:rPr>
-              <w:rFonts w:ascii="Arial" w:cs="Arial" w:eastAsia="Arial" w:hAnsi="Arial"/>
-              <w:b/>
-              <w:bCs/>
-              <w:sz w:val="21"/>
-              <w:szCs w:val="21"/>
-            </w:rPr>
-            <w:t xml:space="preserve">6. Arquitectura end-to-end</w:t>
-          </w:r>
-          <w:r>
-            <w:rPr>
-              <w:rFonts w:ascii="Arial" w:cs="Arial" w:eastAsia="Arial" w:hAnsi="Arial"/>
-              <w:b/>
-              <w:bCs/>
-              <w:sz w:val="21"/>
-              <w:szCs w:val="21"/>
-            </w:rPr>
-            <w:t xml:space="preserve">	8</w:t>
-          </w:r>
-        </w:p>
-        <w:p>
-          <w:pPr>
-            <w:tabs>
-              <w:tab w:val="right" w:pos="9026" w:leader="dot"/>
-            </w:tabs>
-            <w:spacing w:after="40" w:before="0"/>
-            <w:ind w:left="360"/>
-          </w:pPr>
-          <w:r>
-            <w:rPr>
-              <w:rFonts w:ascii="Arial" w:cs="Arial" w:eastAsia="Arial" w:hAnsi="Arial"/>
-              <w:b w:val="false"/>
-              <w:bCs w:val="false"/>
-              <w:sz w:val="20"/>
-              <w:szCs w:val="20"/>
-            </w:rPr>
-            <w:t xml:space="preserve">6.1 Flujo batch</w:t>
-          </w:r>
-          <w:r>
-            <w:rPr>
-              <w:rFonts w:ascii="Arial" w:cs="Arial" w:eastAsia="Arial" w:hAnsi="Arial"/>
-              <w:b w:val="false"/>
-              <w:bCs w:val="false"/>
-              <w:sz w:val="20"/>
-              <w:szCs w:val="20"/>
-            </w:rPr>
-            <w:t xml:space="preserve">	8</w:t>
-          </w:r>
-        </w:p>
-        <w:p>
-          <w:pPr>
-            <w:tabs>
-              <w:tab w:val="right" w:pos="9026" w:leader="dot"/>
-            </w:tabs>
-            <w:spacing w:after="40" w:before="0"/>
-            <w:ind w:left="360"/>
-          </w:pPr>
-          <w:r>
-            <w:rPr>
-              <w:rFonts w:ascii="Arial" w:cs="Arial" w:eastAsia="Arial" w:hAnsi="Arial"/>
-              <w:b w:val="false"/>
-              <w:bCs w:val="false"/>
-              <w:sz w:val="20"/>
-              <w:szCs w:val="20"/>
-            </w:rPr>
-            <w:t xml:space="preserve">6.2 Flujo streaming</w:t>
-          </w:r>
-          <w:r>
-            <w:rPr>
-              <w:rFonts w:ascii="Arial" w:cs="Arial" w:eastAsia="Arial" w:hAnsi="Arial"/>
-              <w:b w:val="false"/>
-              <w:bCs w:val="false"/>
-              <w:sz w:val="20"/>
-              <w:szCs w:val="20"/>
-            </w:rPr>
-            <w:t xml:space="preserve">	9</w:t>
-          </w:r>
-        </w:p>
-        <w:p>
-          <w:pPr>
-            <w:tabs>
-              <w:tab w:val="right" w:pos="9026" w:leader="dot"/>
-            </w:tabs>
-            <w:spacing w:after="40" w:before="0"/>
-            <w:ind w:left="360"/>
-          </w:pPr>
-          <w:r>
-            <w:rPr>
-              <w:rFonts w:ascii="Arial" w:cs="Arial" w:eastAsia="Arial" w:hAnsi="Arial"/>
-              <w:b w:val="false"/>
-              <w:bCs w:val="false"/>
-              <w:sz w:val="20"/>
-              <w:szCs w:val="20"/>
-            </w:rPr>
-            <w:t xml:space="preserve">6.3 Integración multifuente</w:t>
-          </w:r>
-          <w:r>
-            <w:rPr>
-              <w:rFonts w:ascii="Arial" w:cs="Arial" w:eastAsia="Arial" w:hAnsi="Arial"/>
-              <w:b w:val="false"/>
-              <w:bCs w:val="false"/>
-              <w:sz w:val="20"/>
-              <w:szCs w:val="20"/>
-            </w:rPr>
-            <w:t xml:space="preserve">	9</w:t>
-          </w:r>
-        </w:p>
-        <w:p>
-          <w:pPr>
-            <w:tabs>
-              <w:tab w:val="right" w:pos="9026" w:leader="dot"/>
-            </w:tabs>
-            <w:spacing w:after="40" w:before="100"/>
-            <w:ind w:left="0"/>
-          </w:pPr>
-          <w:r>
-            <w:rPr>
-              <w:rFonts w:ascii="Arial" w:cs="Arial" w:eastAsia="Arial" w:hAnsi="Arial"/>
-              <w:b/>
-              <w:bCs/>
-              <w:sz w:val="21"/>
-              <w:szCs w:val="21"/>
-            </w:rPr>
-            <w:t xml:space="preserve">7. Definición de ingesta y almacenamiento</w:t>
-          </w:r>
-          <w:r>
-            <w:rPr>
-              <w:rFonts w:ascii="Arial" w:cs="Arial" w:eastAsia="Arial" w:hAnsi="Arial"/>
-              <w:b/>
-              <w:bCs/>
-              <w:sz w:val="21"/>
-              <w:szCs w:val="21"/>
-            </w:rPr>
-            <w:t xml:space="preserve">	9</w:t>
-          </w:r>
-        </w:p>
-        <w:p>
-          <w:pPr>
-            <w:tabs>
-              <w:tab w:val="right" w:pos="9026" w:leader="dot"/>
-            </w:tabs>
-            <w:spacing w:after="40" w:before="0"/>
-            <w:ind w:left="360"/>
-          </w:pPr>
-          <w:r>
-            <w:rPr>
-              <w:rFonts w:ascii="Arial" w:cs="Arial" w:eastAsia="Arial" w:hAnsi="Arial"/>
-              <w:b w:val="false"/>
-              <w:bCs w:val="false"/>
-              <w:sz w:val="20"/>
-              <w:szCs w:val="20"/>
-            </w:rPr>
-            <w:t xml:space="preserve">7.1 Mecanismos de captura</w:t>
-          </w:r>
-          <w:r>
-            <w:rPr>
-              <w:rFonts w:ascii="Arial" w:cs="Arial" w:eastAsia="Arial" w:hAnsi="Arial"/>
-              <w:b w:val="false"/>
-              <w:bCs w:val="false"/>
-              <w:sz w:val="20"/>
-              <w:szCs w:val="20"/>
-            </w:rPr>
-            <w:t xml:space="preserve">	9</w:t>
-          </w:r>
-        </w:p>
-        <w:p>
-          <w:pPr>
-            <w:tabs>
-              <w:tab w:val="right" w:pos="9026" w:leader="dot"/>
-            </w:tabs>
-            <w:spacing w:after="40" w:before="0"/>
-            <w:ind w:left="360"/>
-          </w:pPr>
-          <w:r>
-            <w:rPr>
-              <w:rFonts w:ascii="Arial" w:cs="Arial" w:eastAsia="Arial" w:hAnsi="Arial"/>
-              <w:b w:val="false"/>
-              <w:bCs w:val="false"/>
-              <w:sz w:val="20"/>
-              <w:szCs w:val="20"/>
-            </w:rPr>
-            <w:t xml:space="preserve">7.2 Motores de almacenamiento y modelo medallion</w:t>
-          </w:r>
-          <w:r>
-            <w:rPr>
-              <w:rFonts w:ascii="Arial" w:cs="Arial" w:eastAsia="Arial" w:hAnsi="Arial"/>
-              <w:b w:val="false"/>
-              <w:bCs w:val="false"/>
-              <w:sz w:val="20"/>
-              <w:szCs w:val="20"/>
-            </w:rPr>
-            <w:t xml:space="preserve">	9</w:t>
-          </w:r>
-        </w:p>
-        <w:p>
-          <w:pPr>
-            <w:tabs>
-              <w:tab w:val="right" w:pos="9026" w:leader="dot"/>
-            </w:tabs>
-            <w:spacing w:after="40" w:before="0"/>
-            <w:ind w:left="360"/>
-          </w:pPr>
-          <w:r>
-            <w:rPr>
-              <w:rFonts w:ascii="Arial" w:cs="Arial" w:eastAsia="Arial" w:hAnsi="Arial"/>
-              <w:b w:val="false"/>
-              <w:bCs w:val="false"/>
-              <w:sz w:val="20"/>
-              <w:szCs w:val="20"/>
-            </w:rPr>
-            <w:t xml:space="preserve">7.3 Implementado para esta entrega</w:t>
-          </w:r>
-          <w:r>
-            <w:rPr>
-              <w:rFonts w:ascii="Arial" w:cs="Arial" w:eastAsia="Arial" w:hAnsi="Arial"/>
-              <w:b w:val="false"/>
-              <w:bCs w:val="false"/>
-              <w:sz w:val="20"/>
-              <w:szCs w:val="20"/>
-            </w:rPr>
-            <w:t xml:space="preserve">	10</w:t>
-          </w:r>
-        </w:p>
-        <w:p>
-          <w:pPr>
-            <w:tabs>
-              <w:tab w:val="right" w:pos="9026" w:leader="dot"/>
-            </w:tabs>
-            <w:spacing w:after="40" w:before="100"/>
-            <w:ind w:left="0"/>
-          </w:pPr>
-          <w:r>
-            <w:rPr>
-              <w:rFonts w:ascii="Arial" w:cs="Arial" w:eastAsia="Arial" w:hAnsi="Arial"/>
-              <w:b/>
-              <w:bCs/>
-              <w:sz w:val="21"/>
-              <w:szCs w:val="21"/>
-            </w:rPr>
-            <w:t xml:space="preserve">8. Escalabilidad y performance</w:t>
-          </w:r>
-          <w:r>
-            <w:rPr>
-              <w:rFonts w:ascii="Arial" w:cs="Arial" w:eastAsia="Arial" w:hAnsi="Arial"/>
-              <w:b/>
-              <w:bCs/>
-              <w:sz w:val="21"/>
-              <w:szCs w:val="21"/>
-            </w:rPr>
-            <w:t xml:space="preserve">	10</w:t>
-          </w:r>
-        </w:p>
-        <w:p>
-          <w:pPr>
-            <w:tabs>
-              <w:tab w:val="right" w:pos="9026" w:leader="dot"/>
-            </w:tabs>
-            <w:spacing w:after="40" w:before="0"/>
-            <w:ind w:left="360"/>
-          </w:pPr>
-          <w:r>
-            <w:rPr>
-              <w:rFonts w:ascii="Arial" w:cs="Arial" w:eastAsia="Arial" w:hAnsi="Arial"/>
-              <w:b w:val="false"/>
-              <w:bCs w:val="false"/>
-              <w:sz w:val="20"/>
-              <w:szCs w:val="20"/>
-            </w:rPr>
-            <w:t xml:space="preserve">8.1 Degradación controlada</w:t>
-          </w:r>
-          <w:r>
-            <w:rPr>
-              <w:rFonts w:ascii="Arial" w:cs="Arial" w:eastAsia="Arial" w:hAnsi="Arial"/>
-              <w:b w:val="false"/>
-              <w:bCs w:val="false"/>
-              <w:sz w:val="20"/>
-              <w:szCs w:val="20"/>
-            </w:rPr>
-            <w:t xml:space="preserve">	11</w:t>
-          </w:r>
-        </w:p>
-        <w:p>
-          <w:pPr>
-            <w:tabs>
-              <w:tab w:val="right" w:pos="9026" w:leader="dot"/>
-            </w:tabs>
-            <w:spacing w:after="40" w:before="0"/>
-            <w:ind w:left="360"/>
-          </w:pPr>
-          <w:r>
-            <w:rPr>
-              <w:rFonts w:ascii="Arial" w:cs="Arial" w:eastAsia="Arial" w:hAnsi="Arial"/>
-              <w:b w:val="false"/>
-              <w:bCs w:val="false"/>
-              <w:sz w:val="20"/>
-              <w:szCs w:val="20"/>
-            </w:rPr>
-            <w:t xml:space="preserve">8.2 Metas de performance</w:t>
-          </w:r>
-          <w:r>
-            <w:rPr>
-              <w:rFonts w:ascii="Arial" w:cs="Arial" w:eastAsia="Arial" w:hAnsi="Arial"/>
-              <w:b w:val="false"/>
-              <w:bCs w:val="false"/>
-              <w:sz w:val="20"/>
-              <w:szCs w:val="20"/>
-            </w:rPr>
-            <w:t xml:space="preserve">	11</w:t>
-          </w:r>
-        </w:p>
-        <w:p>
-          <w:pPr>
-            <w:tabs>
-              <w:tab w:val="right" w:pos="9026" w:leader="dot"/>
-            </w:tabs>
-            <w:spacing w:after="40" w:before="100"/>
-            <w:ind w:left="0"/>
-          </w:pPr>
-          <w:r>
-            <w:rPr>
-              <w:rFonts w:ascii="Arial" w:cs="Arial" w:eastAsia="Arial" w:hAnsi="Arial"/>
-              <w:b/>
-              <w:bCs/>
-              <w:sz w:val="21"/>
-              <w:szCs w:val="21"/>
-            </w:rPr>
-            <w:t xml:space="preserve">9. Justificación económica y optimización de costos</w:t>
-          </w:r>
-          <w:r>
-            <w:rPr>
-              <w:rFonts w:ascii="Arial" w:cs="Arial" w:eastAsia="Arial" w:hAnsi="Arial"/>
-              <w:b/>
-              <w:bCs/>
-              <w:sz w:val="21"/>
-              <w:szCs w:val="21"/>
-            </w:rPr>
-            <w:t xml:space="preserve">	11</w:t>
-          </w:r>
-        </w:p>
-        <w:p>
-          <w:pPr>
-            <w:tabs>
-              <w:tab w:val="right" w:pos="9026" w:leader="dot"/>
-            </w:tabs>
-            <w:spacing w:after="40" w:before="0"/>
-            <w:ind w:left="360"/>
-          </w:pPr>
-          <w:r>
-            <w:rPr>
-              <w:rFonts w:ascii="Arial" w:cs="Arial" w:eastAsia="Arial" w:hAnsi="Arial"/>
-              <w:b w:val="false"/>
-              <w:bCs w:val="false"/>
-              <w:sz w:val="20"/>
-              <w:szCs w:val="20"/>
-            </w:rPr>
-            <w:t xml:space="preserve">9.1 Escenarios</w:t>
-          </w:r>
-          <w:r>
-            <w:rPr>
-              <w:rFonts w:ascii="Arial" w:cs="Arial" w:eastAsia="Arial" w:hAnsi="Arial"/>
-              <w:b w:val="false"/>
-              <w:bCs w:val="false"/>
-              <w:sz w:val="20"/>
-              <w:szCs w:val="20"/>
-            </w:rPr>
-            <w:t xml:space="preserve">	11</w:t>
-          </w:r>
-        </w:p>
-        <w:p>
-          <w:pPr>
-            <w:tabs>
-              <w:tab w:val="right" w:pos="9026" w:leader="dot"/>
-            </w:tabs>
-            <w:spacing w:after="40" w:before="0"/>
-            <w:ind w:left="360"/>
-          </w:pPr>
-          <w:r>
-            <w:rPr>
-              <w:rFonts w:ascii="Arial" w:cs="Arial" w:eastAsia="Arial" w:hAnsi="Arial"/>
-              <w:b w:val="false"/>
-              <w:bCs w:val="false"/>
-              <w:sz w:val="20"/>
-              <w:szCs w:val="20"/>
-            </w:rPr>
-            <w:t xml:space="preserve">9.2 Palancas de optimización aplicadas</w:t>
-          </w:r>
-          <w:r>
-            <w:rPr>
-              <w:rFonts w:ascii="Arial" w:cs="Arial" w:eastAsia="Arial" w:hAnsi="Arial"/>
-              <w:b w:val="false"/>
-              <w:bCs w:val="false"/>
-              <w:sz w:val="20"/>
-              <w:szCs w:val="20"/>
-            </w:rPr>
-            <w:t xml:space="preserve">	12</w:t>
-          </w:r>
-        </w:p>
-        <w:p>
-          <w:pPr>
-            <w:tabs>
-              <w:tab w:val="right" w:pos="9026" w:leader="dot"/>
-            </w:tabs>
-            <w:spacing w:after="40" w:before="0"/>
-            <w:ind w:left="360"/>
-          </w:pPr>
-          <w:r>
-            <w:rPr>
-              <w:rFonts w:ascii="Arial" w:cs="Arial" w:eastAsia="Arial" w:hAnsi="Arial"/>
-              <w:b w:val="false"/>
-              <w:bCs w:val="false"/>
-              <w:sz w:val="20"/>
-              <w:szCs w:val="20"/>
-            </w:rPr>
-            <w:t xml:space="preserve">9.3 Automatización de costos</w:t>
-          </w:r>
-          <w:r>
-            <w:rPr>
-              <w:rFonts w:ascii="Arial" w:cs="Arial" w:eastAsia="Arial" w:hAnsi="Arial"/>
-              <w:b w:val="false"/>
-              <w:bCs w:val="false"/>
-              <w:sz w:val="20"/>
-              <w:szCs w:val="20"/>
-            </w:rPr>
-            <w:t xml:space="preserve">	12</w:t>
-          </w:r>
-        </w:p>
-        <w:p>
-          <w:pPr>
-            <w:tabs>
-              <w:tab w:val="right" w:pos="9026" w:leader="dot"/>
-            </w:tabs>
-            <w:spacing w:after="40" w:before="100"/>
-            <w:ind w:left="0"/>
-          </w:pPr>
-          <w:r>
-            <w:rPr>
-              <w:rFonts w:ascii="Arial" w:cs="Arial" w:eastAsia="Arial" w:hAnsi="Arial"/>
-              <w:b/>
-              <w:bCs/>
-              <w:sz w:val="21"/>
-              <w:szCs w:val="21"/>
-            </w:rPr>
-            <w:t xml:space="preserve">10. Plan de recuperación y alta disponibilidad (DRP/HA)</w:t>
-          </w:r>
-          <w:r>
-            <w:rPr>
-              <w:rFonts w:ascii="Arial" w:cs="Arial" w:eastAsia="Arial" w:hAnsi="Arial"/>
-              <w:b/>
-              <w:bCs/>
-              <w:sz w:val="21"/>
-              <w:szCs w:val="21"/>
-            </w:rPr>
-            <w:t xml:space="preserve">	12</w:t>
-          </w:r>
-        </w:p>
-        <w:p>
-          <w:pPr>
-            <w:tabs>
-              <w:tab w:val="right" w:pos="9026" w:leader="dot"/>
-            </w:tabs>
-            <w:spacing w:after="40" w:before="0"/>
-            <w:ind w:left="360"/>
-          </w:pPr>
-          <w:r>
-            <w:rPr>
-              <w:rFonts w:ascii="Arial" w:cs="Arial" w:eastAsia="Arial" w:hAnsi="Arial"/>
-              <w:b w:val="false"/>
-              <w:bCs w:val="false"/>
-              <w:sz w:val="20"/>
-              <w:szCs w:val="20"/>
-            </w:rPr>
-            <w:t xml:space="preserve">10.1 Prototipo frente a producción</w:t>
-          </w:r>
-          <w:r>
-            <w:rPr>
-              <w:rFonts w:ascii="Arial" w:cs="Arial" w:eastAsia="Arial" w:hAnsi="Arial"/>
-              <w:b w:val="false"/>
-              <w:bCs w:val="false"/>
-              <w:sz w:val="20"/>
-              <w:szCs w:val="20"/>
-            </w:rPr>
-            <w:t xml:space="preserve">	13</w:t>
-          </w:r>
-        </w:p>
-        <w:p>
-          <w:pPr>
-            <w:tabs>
-              <w:tab w:val="right" w:pos="9026" w:leader="dot"/>
-            </w:tabs>
-            <w:spacing w:after="40" w:before="100"/>
-            <w:ind w:left="0"/>
-          </w:pPr>
-          <w:r>
-            <w:rPr>
-              <w:rFonts w:ascii="Arial" w:cs="Arial" w:eastAsia="Arial" w:hAnsi="Arial"/>
-              <w:b/>
-              <w:bCs/>
-              <w:sz w:val="21"/>
-              <w:szCs w:val="21"/>
-            </w:rPr>
-            <w:t xml:space="preserve">11. KPIs de éxito y performance</w:t>
-          </w:r>
-          <w:r>
-            <w:rPr>
-              <w:rFonts w:ascii="Arial" w:cs="Arial" w:eastAsia="Arial" w:hAnsi="Arial"/>
-              <w:b/>
-              <w:bCs/>
-              <w:sz w:val="21"/>
-              <w:szCs w:val="21"/>
-            </w:rPr>
-            <w:t xml:space="preserve">	13</w:t>
-          </w:r>
-        </w:p>
-        <w:p>
-          <w:pPr>
-            <w:tabs>
-              <w:tab w:val="right" w:pos="9026" w:leader="dot"/>
-            </w:tabs>
-            <w:spacing w:after="40" w:before="100"/>
-            <w:ind w:left="0"/>
-          </w:pPr>
-          <w:r>
-            <w:rPr>
-              <w:rFonts w:ascii="Arial" w:cs="Arial" w:eastAsia="Arial" w:hAnsi="Arial"/>
-              <w:b/>
-              <w:bCs/>
-              <w:sz w:val="21"/>
-              <w:szCs w:val="21"/>
-            </w:rPr>
-            <w:t xml:space="preserve">12. Seguridad y gobierno</w:t>
-          </w:r>
-          <w:r>
-            <w:rPr>
-              <w:rFonts w:ascii="Arial" w:cs="Arial" w:eastAsia="Arial" w:hAnsi="Arial"/>
-              <w:b/>
-              <w:bCs/>
-              <w:sz w:val="21"/>
-              <w:szCs w:val="21"/>
-            </w:rPr>
-            <w:t xml:space="preserve">	14</w:t>
-          </w:r>
-        </w:p>
-        <w:p>
-          <w:pPr>
-            <w:tabs>
-              <w:tab w:val="right" w:pos="9026" w:leader="dot"/>
-            </w:tabs>
-            <w:spacing w:after="40" w:before="100"/>
-            <w:ind w:left="0"/>
-          </w:pPr>
-          <w:r>
-            <w:rPr>
-              <w:rFonts w:ascii="Arial" w:cs="Arial" w:eastAsia="Arial" w:hAnsi="Arial"/>
-              <w:b/>
-              <w:bCs/>
-              <w:sz w:val="21"/>
-              <w:szCs w:val="21"/>
-            </w:rPr>
-            <w:t xml:space="preserve">13. Plan de trabajo por entregas</w:t>
-          </w:r>
-          <w:r>
-            <w:rPr>
-              <w:rFonts w:ascii="Arial" w:cs="Arial" w:eastAsia="Arial" w:hAnsi="Arial"/>
-              <w:b/>
-              <w:bCs/>
-              <w:sz w:val="21"/>
-              <w:szCs w:val="21"/>
-            </w:rPr>
-            <w:t xml:space="preserve">	14</w:t>
-          </w:r>
-        </w:p>
-        <w:p>
-          <w:pPr>
-            <w:tabs>
-              <w:tab w:val="right" w:pos="9026" w:leader="dot"/>
-            </w:tabs>
-            <w:spacing w:after="40" w:before="100"/>
-            <w:ind w:left="0"/>
-          </w:pPr>
-          <w:r>
-            <w:rPr>
-              <w:rFonts w:ascii="Arial" w:cs="Arial" w:eastAsia="Arial" w:hAnsi="Arial"/>
-              <w:b/>
-              <w:bCs/>
-              <w:sz w:val="21"/>
-              <w:szCs w:val="21"/>
-            </w:rPr>
-            <w:t xml:space="preserve">14. Riesgos y mitigaciones</w:t>
-          </w:r>
-          <w:r>
-            <w:rPr>
-              <w:rFonts w:ascii="Arial" w:cs="Arial" w:eastAsia="Arial" w:hAnsi="Arial"/>
-              <w:b/>
-              <w:bCs/>
-              <w:sz w:val="21"/>
-              <w:szCs w:val="21"/>
-            </w:rPr>
-            <w:t xml:space="preserve">	14</w:t>
-          </w:r>
-        </w:p>
-        <w:p>
-          <w:pPr>
-            <w:tabs>
-              <w:tab w:val="right" w:pos="9026" w:leader="dot"/>
-            </w:tabs>
-            <w:spacing w:after="40" w:before="100"/>
-            <w:ind w:left="0"/>
-          </w:pPr>
-          <w:r>
-            <w:rPr>
-              <w:rFonts w:ascii="Arial" w:cs="Arial" w:eastAsia="Arial" w:hAnsi="Arial"/>
-              <w:b/>
-              <w:bCs/>
-              <w:sz w:val="21"/>
-              <w:szCs w:val="21"/>
-            </w:rPr>
-            <w:t xml:space="preserve">Anexo A. Repositorio y reproducibilidad</w:t>
-          </w:r>
-          <w:r>
-            <w:rPr>
-              <w:rFonts w:ascii="Arial" w:cs="Arial" w:eastAsia="Arial" w:hAnsi="Arial"/>
-              <w:b/>
-              <w:bCs/>
-              <w:sz w:val="21"/>
-              <w:szCs w:val="21"/>
-            </w:rPr>
-            <w:t xml:space="preserve">	14</w:t>
-          </w:r>
-        </w:p>
-        <w:p>
-          <w:pPr>
-            <w:tabs>
-              <w:tab w:val="right" w:pos="9026" w:leader="dot"/>
-            </w:tabs>
-            <w:spacing w:after="40" w:before="100"/>
-            <w:ind w:left="0"/>
-          </w:pPr>
-          <w:r>
-            <w:rPr>
-              <w:rFonts w:ascii="Arial" w:cs="Arial" w:eastAsia="Arial" w:hAnsi="Arial"/>
-              <w:b/>
-              <w:bCs/>
-              <w:sz w:val="21"/>
-              <w:szCs w:val="21"/>
-            </w:rPr>
-            <w:t xml:space="preserve">Referencias</w:t>
-          </w:r>
-          <w:r>
-            <w:rPr>
-              <w:rFonts w:ascii="Arial" w:cs="Arial" w:eastAsia="Arial" w:hAnsi="Arial"/>
-              <w:b/>
-              <w:bCs/>
-              <w:sz w:val="21"/>
-              <w:szCs w:val="21"/>
-            </w:rPr>
-            <w:t xml:space="preserve">	15</w:t>
-          </w:r>
-        </w:p>
-        <w:p>
           <w:r>
             <w:fldChar w:fldCharType="end"/>
           </w:r>
@@ -2196,6 +1181,1021 @@
       </w:sdtContent>
     </w:sdt>
     <w:p>
+      <w:pPr>
+        <w:tabs>
+          <w:tab w:val="right" w:pos="9026" w:leader="dot"/>
+        </w:tabs>
+        <w:spacing w:after="40" w:before="100"/>
+        <w:ind w:left="0"/>
+      </w:pPr>
+      <w:r>
+        <w:rPr>
+          <w:rFonts w:ascii="Arial" w:cs="Arial" w:eastAsia="Arial" w:hAnsi="Arial"/>
+          <w:b/>
+          <w:bCs/>
+          <w:sz w:val="21"/>
+          <w:szCs w:val="21"/>
+        </w:rPr>
+        <w:t xml:space="preserve">1. Resumen ejecutivo</w:t>
+      </w:r>
+      <w:r>
+        <w:rPr>
+          <w:rFonts w:ascii="Arial" w:cs="Arial" w:eastAsia="Arial" w:hAnsi="Arial"/>
+          <w:b/>
+          <w:bCs/>
+          <w:sz w:val="21"/>
+          <w:szCs w:val="21"/>
+        </w:rPr>
+        <w:t xml:space="preserve">	4</w:t>
+      </w:r>
+    </w:p>
+    <w:p>
+      <w:pPr>
+        <w:tabs>
+          <w:tab w:val="right" w:pos="9026" w:leader="dot"/>
+        </w:tabs>
+        <w:spacing w:after="40" w:before="100"/>
+        <w:ind w:left="0"/>
+      </w:pPr>
+      <w:r>
+        <w:rPr>
+          <w:rFonts w:ascii="Arial" w:cs="Arial" w:eastAsia="Arial" w:hAnsi="Arial"/>
+          <w:b/>
+          <w:bCs/>
+          <w:sz w:val="21"/>
+          <w:szCs w:val="21"/>
+        </w:rPr>
+        <w:t xml:space="preserve">2. Contexto de negocio y alcance</w:t>
+      </w:r>
+      <w:r>
+        <w:rPr>
+          <w:rFonts w:ascii="Arial" w:cs="Arial" w:eastAsia="Arial" w:hAnsi="Arial"/>
+          <w:b/>
+          <w:bCs/>
+          <w:sz w:val="21"/>
+          <w:szCs w:val="21"/>
+        </w:rPr>
+        <w:t xml:space="preserve">	4</w:t>
+      </w:r>
+    </w:p>
+    <w:p>
+      <w:pPr>
+        <w:tabs>
+          <w:tab w:val="right" w:pos="9026" w:leader="dot"/>
+        </w:tabs>
+        <w:spacing w:after="40" w:before="0"/>
+        <w:ind w:left="360"/>
+      </w:pPr>
+      <w:r>
+        <w:rPr>
+          <w:rFonts w:ascii="Arial" w:cs="Arial" w:eastAsia="Arial" w:hAnsi="Arial"/>
+          <w:b w:val="false"/>
+          <w:bCs w:val="false"/>
+          <w:sz w:val="20"/>
+          <w:szCs w:val="20"/>
+        </w:rPr>
+        <w:t xml:space="preserve">2.1 Problema</w:t>
+      </w:r>
+      <w:r>
+        <w:rPr>
+          <w:rFonts w:ascii="Arial" w:cs="Arial" w:eastAsia="Arial" w:hAnsi="Arial"/>
+          <w:b w:val="false"/>
+          <w:bCs w:val="false"/>
+          <w:sz w:val="20"/>
+          <w:szCs w:val="20"/>
+        </w:rPr>
+        <w:t xml:space="preserve">	4</w:t>
+      </w:r>
+    </w:p>
+    <w:p>
+      <w:pPr>
+        <w:tabs>
+          <w:tab w:val="right" w:pos="9026" w:leader="dot"/>
+        </w:tabs>
+        <w:spacing w:after="40" w:before="0"/>
+        <w:ind w:left="360"/>
+      </w:pPr>
+      <w:r>
+        <w:rPr>
+          <w:rFonts w:ascii="Arial" w:cs="Arial" w:eastAsia="Arial" w:hAnsi="Arial"/>
+          <w:b w:val="false"/>
+          <w:bCs w:val="false"/>
+          <w:sz w:val="20"/>
+          <w:szCs w:val="20"/>
+        </w:rPr>
+        <w:t xml:space="preserve">2.2 Objetivos</w:t>
+      </w:r>
+      <w:r>
+        <w:rPr>
+          <w:rFonts w:ascii="Arial" w:cs="Arial" w:eastAsia="Arial" w:hAnsi="Arial"/>
+          <w:b w:val="false"/>
+          <w:bCs w:val="false"/>
+          <w:sz w:val="20"/>
+          <w:szCs w:val="20"/>
+        </w:rPr>
+        <w:t xml:space="preserve">	4</w:t>
+      </w:r>
+    </w:p>
+    <w:p>
+      <w:pPr>
+        <w:tabs>
+          <w:tab w:val="right" w:pos="9026" w:leader="dot"/>
+        </w:tabs>
+        <w:spacing w:after="40" w:before="0"/>
+        <w:ind w:left="360"/>
+      </w:pPr>
+      <w:r>
+        <w:rPr>
+          <w:rFonts w:ascii="Arial" w:cs="Arial" w:eastAsia="Arial" w:hAnsi="Arial"/>
+          <w:b w:val="false"/>
+          <w:bCs w:val="false"/>
+          <w:sz w:val="20"/>
+          <w:szCs w:val="20"/>
+        </w:rPr>
+        <w:t xml:space="preserve">2.3 Alcance y fuera de alcance</w:t>
+      </w:r>
+      <w:r>
+        <w:rPr>
+          <w:rFonts w:ascii="Arial" w:cs="Arial" w:eastAsia="Arial" w:hAnsi="Arial"/>
+          <w:b w:val="false"/>
+          <w:bCs w:val="false"/>
+          <w:sz w:val="20"/>
+          <w:szCs w:val="20"/>
+        </w:rPr>
+        <w:t xml:space="preserve">	5</w:t>
+      </w:r>
+    </w:p>
+    <w:p>
+      <w:pPr>
+        <w:tabs>
+          <w:tab w:val="right" w:pos="9026" w:leader="dot"/>
+        </w:tabs>
+        <w:spacing w:after="40" w:before="0"/>
+        <w:ind w:left="360"/>
+      </w:pPr>
+      <w:r>
+        <w:rPr>
+          <w:rFonts w:ascii="Arial" w:cs="Arial" w:eastAsia="Arial" w:hAnsi="Arial"/>
+          <w:b w:val="false"/>
+          <w:bCs w:val="false"/>
+          <w:sz w:val="20"/>
+          <w:szCs w:val="20"/>
+        </w:rPr>
+        <w:t xml:space="preserve">2.4 Supuestos</w:t>
+      </w:r>
+      <w:r>
+        <w:rPr>
+          <w:rFonts w:ascii="Arial" w:cs="Arial" w:eastAsia="Arial" w:hAnsi="Arial"/>
+          <w:b w:val="false"/>
+          <w:bCs w:val="false"/>
+          <w:sz w:val="20"/>
+          <w:szCs w:val="20"/>
+        </w:rPr>
+        <w:t xml:space="preserve">	5</w:t>
+      </w:r>
+    </w:p>
+    <w:p>
+      <w:pPr>
+        <w:tabs>
+          <w:tab w:val="right" w:pos="9026" w:leader="dot"/>
+        </w:tabs>
+        <w:spacing w:after="40" w:before="100"/>
+        <w:ind w:left="0"/>
+      </w:pPr>
+      <w:r>
+        <w:rPr>
+          <w:rFonts w:ascii="Arial" w:cs="Arial" w:eastAsia="Arial" w:hAnsi="Arial"/>
+          <w:b/>
+          <w:bCs/>
+          <w:sz w:val="21"/>
+          <w:szCs w:val="21"/>
+        </w:rPr>
+        <w:t xml:space="preserve">3. Equipo y roles</w:t>
+      </w:r>
+      <w:r>
+        <w:rPr>
+          <w:rFonts w:ascii="Arial" w:cs="Arial" w:eastAsia="Arial" w:hAnsi="Arial"/>
+          <w:b/>
+          <w:bCs/>
+          <w:sz w:val="21"/>
+          <w:szCs w:val="21"/>
+        </w:rPr>
+        <w:t xml:space="preserve">	5</w:t>
+      </w:r>
+    </w:p>
+    <w:p>
+      <w:pPr>
+        <w:tabs>
+          <w:tab w:val="right" w:pos="9026" w:leader="dot"/>
+        </w:tabs>
+        <w:spacing w:after="40" w:before="100"/>
+        <w:ind w:left="0"/>
+      </w:pPr>
+      <w:r>
+        <w:rPr>
+          <w:rFonts w:ascii="Arial" w:cs="Arial" w:eastAsia="Arial" w:hAnsi="Arial"/>
+          <w:b/>
+          <w:bCs/>
+          <w:sz w:val="21"/>
+          <w:szCs w:val="21"/>
+        </w:rPr>
+        <w:t xml:space="preserve">4. Inventario y perfil de datos</w:t>
+      </w:r>
+      <w:r>
+        <w:rPr>
+          <w:rFonts w:ascii="Arial" w:cs="Arial" w:eastAsia="Arial" w:hAnsi="Arial"/>
+          <w:b/>
+          <w:bCs/>
+          <w:sz w:val="21"/>
+          <w:szCs w:val="21"/>
+        </w:rPr>
+        <w:t xml:space="preserve">	6</w:t>
+      </w:r>
+    </w:p>
+    <w:p>
+      <w:pPr>
+        <w:tabs>
+          <w:tab w:val="right" w:pos="9026" w:leader="dot"/>
+        </w:tabs>
+        <w:spacing w:after="40" w:before="0"/>
+        <w:ind w:left="360"/>
+      </w:pPr>
+      <w:r>
+        <w:rPr>
+          <w:rFonts w:ascii="Arial" w:cs="Arial" w:eastAsia="Arial" w:hAnsi="Arial"/>
+          <w:b w:val="false"/>
+          <w:bCs w:val="false"/>
+          <w:sz w:val="20"/>
+          <w:szCs w:val="20"/>
+        </w:rPr>
+        <w:t xml:space="preserve">4.1 Hallazgos de calidad</w:t>
+      </w:r>
+      <w:r>
+        <w:rPr>
+          <w:rFonts w:ascii="Arial" w:cs="Arial" w:eastAsia="Arial" w:hAnsi="Arial"/>
+          <w:b w:val="false"/>
+          <w:bCs w:val="false"/>
+          <w:sz w:val="20"/>
+          <w:szCs w:val="20"/>
+        </w:rPr>
+        <w:t xml:space="preserve">	6</w:t>
+      </w:r>
+    </w:p>
+    <w:p>
+      <w:pPr>
+        <w:tabs>
+          <w:tab w:val="right" w:pos="9026" w:leader="dot"/>
+        </w:tabs>
+        <w:spacing w:after="40" w:before="0"/>
+        <w:ind w:left="360"/>
+      </w:pPr>
+      <w:r>
+        <w:rPr>
+          <w:rFonts w:ascii="Arial" w:cs="Arial" w:eastAsia="Arial" w:hAnsi="Arial"/>
+          <w:b w:val="false"/>
+          <w:bCs w:val="false"/>
+          <w:sz w:val="20"/>
+          <w:szCs w:val="20"/>
+        </w:rPr>
+        <w:t xml:space="preserve">4.2 Patrones de negocio útiles para el diseño</w:t>
+      </w:r>
+      <w:r>
+        <w:rPr>
+          <w:rFonts w:ascii="Arial" w:cs="Arial" w:eastAsia="Arial" w:hAnsi="Arial"/>
+          <w:b w:val="false"/>
+          <w:bCs w:val="false"/>
+          <w:sz w:val="20"/>
+          <w:szCs w:val="20"/>
+        </w:rPr>
+        <w:t xml:space="preserve">	6</w:t>
+      </w:r>
+    </w:p>
+    <w:p>
+      <w:pPr>
+        <w:tabs>
+          <w:tab w:val="right" w:pos="9026" w:leader="dot"/>
+        </w:tabs>
+        <w:spacing w:after="40" w:before="0"/>
+        <w:ind w:left="360"/>
+      </w:pPr>
+      <w:r>
+        <w:rPr>
+          <w:rFonts w:ascii="Arial" w:cs="Arial" w:eastAsia="Arial" w:hAnsi="Arial"/>
+          <w:b w:val="false"/>
+          <w:bCs w:val="false"/>
+          <w:sz w:val="20"/>
+          <w:szCs w:val="20"/>
+        </w:rPr>
+        <w:t xml:space="preserve">4.3 Decisión sobre la fuente Amazon Reviews 2023</w:t>
+      </w:r>
+      <w:r>
+        <w:rPr>
+          <w:rFonts w:ascii="Arial" w:cs="Arial" w:eastAsia="Arial" w:hAnsi="Arial"/>
+          <w:b w:val="false"/>
+          <w:bCs w:val="false"/>
+          <w:sz w:val="20"/>
+          <w:szCs w:val="20"/>
+        </w:rPr>
+        <w:t xml:space="preserve">	6</w:t>
+      </w:r>
+    </w:p>
+    <w:p>
+      <w:pPr>
+        <w:tabs>
+          <w:tab w:val="right" w:pos="9026" w:leader="dot"/>
+        </w:tabs>
+        <w:spacing w:after="40" w:before="100"/>
+        <w:ind w:left="0"/>
+      </w:pPr>
+      <w:r>
+        <w:rPr>
+          <w:rFonts w:ascii="Arial" w:cs="Arial" w:eastAsia="Arial" w:hAnsi="Arial"/>
+          <w:b/>
+          <w:bCs/>
+          <w:sz w:val="21"/>
+          <w:szCs w:val="21"/>
+        </w:rPr>
+        <w:t xml:space="preserve">5. Stack tecnológico y justificación</w:t>
+      </w:r>
+      <w:r>
+        <w:rPr>
+          <w:rFonts w:ascii="Arial" w:cs="Arial" w:eastAsia="Arial" w:hAnsi="Arial"/>
+          <w:b/>
+          <w:bCs/>
+          <w:sz w:val="21"/>
+          <w:szCs w:val="21"/>
+        </w:rPr>
+        <w:t xml:space="preserve">	7</w:t>
+      </w:r>
+    </w:p>
+    <w:p>
+      <w:pPr>
+        <w:tabs>
+          <w:tab w:val="right" w:pos="9026" w:leader="dot"/>
+        </w:tabs>
+        <w:spacing w:after="40" w:before="100"/>
+        <w:ind w:left="0"/>
+      </w:pPr>
+      <w:r>
+        <w:rPr>
+          <w:rFonts w:ascii="Arial" w:cs="Arial" w:eastAsia="Arial" w:hAnsi="Arial"/>
+          <w:b/>
+          <w:bCs/>
+          <w:sz w:val="21"/>
+          <w:szCs w:val="21"/>
+        </w:rPr>
+        <w:t xml:space="preserve">6. Arquitectura end-to-end</w:t>
+      </w:r>
+      <w:r>
+        <w:rPr>
+          <w:rFonts w:ascii="Arial" w:cs="Arial" w:eastAsia="Arial" w:hAnsi="Arial"/>
+          <w:b/>
+          <w:bCs/>
+          <w:sz w:val="21"/>
+          <w:szCs w:val="21"/>
+        </w:rPr>
+        <w:t xml:space="preserve">	8</w:t>
+      </w:r>
+    </w:p>
+    <w:p>
+      <w:pPr>
+        <w:tabs>
+          <w:tab w:val="right" w:pos="9026" w:leader="dot"/>
+        </w:tabs>
+        <w:spacing w:after="40" w:before="0"/>
+        <w:ind w:left="360"/>
+      </w:pPr>
+      <w:r>
+        <w:rPr>
+          <w:rFonts w:ascii="Arial" w:cs="Arial" w:eastAsia="Arial" w:hAnsi="Arial"/>
+          <w:b w:val="false"/>
+          <w:bCs w:val="false"/>
+          <w:sz w:val="20"/>
+          <w:szCs w:val="20"/>
+        </w:rPr>
+        <w:t xml:space="preserve">6.1 Flujo batch</w:t>
+      </w:r>
+      <w:r>
+        <w:rPr>
+          <w:rFonts w:ascii="Arial" w:cs="Arial" w:eastAsia="Arial" w:hAnsi="Arial"/>
+          <w:b w:val="false"/>
+          <w:bCs w:val="false"/>
+          <w:sz w:val="20"/>
+          <w:szCs w:val="20"/>
+        </w:rPr>
+        <w:t xml:space="preserve">	8</w:t>
+      </w:r>
+    </w:p>
+    <w:p>
+      <w:pPr>
+        <w:tabs>
+          <w:tab w:val="right" w:pos="9026" w:leader="dot"/>
+        </w:tabs>
+        <w:spacing w:after="40" w:before="0"/>
+        <w:ind w:left="360"/>
+      </w:pPr>
+      <w:r>
+        <w:rPr>
+          <w:rFonts w:ascii="Arial" w:cs="Arial" w:eastAsia="Arial" w:hAnsi="Arial"/>
+          <w:b w:val="false"/>
+          <w:bCs w:val="false"/>
+          <w:sz w:val="20"/>
+          <w:szCs w:val="20"/>
+        </w:rPr>
+        <w:t xml:space="preserve">6.2 Flujo streaming</w:t>
+      </w:r>
+      <w:r>
+        <w:rPr>
+          <w:rFonts w:ascii="Arial" w:cs="Arial" w:eastAsia="Arial" w:hAnsi="Arial"/>
+          <w:b w:val="false"/>
+          <w:bCs w:val="false"/>
+          <w:sz w:val="20"/>
+          <w:szCs w:val="20"/>
+        </w:rPr>
+        <w:t xml:space="preserve">	9</w:t>
+      </w:r>
+    </w:p>
+    <w:p>
+      <w:pPr>
+        <w:tabs>
+          <w:tab w:val="right" w:pos="9026" w:leader="dot"/>
+        </w:tabs>
+        <w:spacing w:after="40" w:before="0"/>
+        <w:ind w:left="360"/>
+      </w:pPr>
+      <w:r>
+        <w:rPr>
+          <w:rFonts w:ascii="Arial" w:cs="Arial" w:eastAsia="Arial" w:hAnsi="Arial"/>
+          <w:b w:val="false"/>
+          <w:bCs w:val="false"/>
+          <w:sz w:val="20"/>
+          <w:szCs w:val="20"/>
+        </w:rPr>
+        <w:t xml:space="preserve">6.3 Integración multifuente</w:t>
+      </w:r>
+      <w:r>
+        <w:rPr>
+          <w:rFonts w:ascii="Arial" w:cs="Arial" w:eastAsia="Arial" w:hAnsi="Arial"/>
+          <w:b w:val="false"/>
+          <w:bCs w:val="false"/>
+          <w:sz w:val="20"/>
+          <w:szCs w:val="20"/>
+        </w:rPr>
+        <w:t xml:space="preserve">	9</w:t>
+      </w:r>
+    </w:p>
+    <w:p>
+      <w:pPr>
+        <w:tabs>
+          <w:tab w:val="right" w:pos="9026" w:leader="dot"/>
+        </w:tabs>
+        <w:spacing w:after="40" w:before="100"/>
+        <w:ind w:left="0"/>
+      </w:pPr>
+      <w:r>
+        <w:rPr>
+          <w:rFonts w:ascii="Arial" w:cs="Arial" w:eastAsia="Arial" w:hAnsi="Arial"/>
+          <w:b/>
+          <w:bCs/>
+          <w:sz w:val="21"/>
+          <w:szCs w:val="21"/>
+        </w:rPr>
+        <w:t xml:space="preserve">7. Definición de ingesta y almacenamiento</w:t>
+      </w:r>
+      <w:r>
+        <w:rPr>
+          <w:rFonts w:ascii="Arial" w:cs="Arial" w:eastAsia="Arial" w:hAnsi="Arial"/>
+          <w:b/>
+          <w:bCs/>
+          <w:sz w:val="21"/>
+          <w:szCs w:val="21"/>
+        </w:rPr>
+        <w:t xml:space="preserve">	9</w:t>
+      </w:r>
+    </w:p>
+    <w:p>
+      <w:pPr>
+        <w:tabs>
+          <w:tab w:val="right" w:pos="9026" w:leader="dot"/>
+        </w:tabs>
+        <w:spacing w:after="40" w:before="0"/>
+        <w:ind w:left="360"/>
+      </w:pPr>
+      <w:r>
+        <w:rPr>
+          <w:rFonts w:ascii="Arial" w:cs="Arial" w:eastAsia="Arial" w:hAnsi="Arial"/>
+          <w:b w:val="false"/>
+          <w:bCs w:val="false"/>
+          <w:sz w:val="20"/>
+          <w:szCs w:val="20"/>
+        </w:rPr>
+        <w:t xml:space="preserve">7.1 Mecanismos de captura</w:t>
+      </w:r>
+      <w:r>
+        <w:rPr>
+          <w:rFonts w:ascii="Arial" w:cs="Arial" w:eastAsia="Arial" w:hAnsi="Arial"/>
+          <w:b w:val="false"/>
+          <w:bCs w:val="false"/>
+          <w:sz w:val="20"/>
+          <w:szCs w:val="20"/>
+        </w:rPr>
+        <w:t xml:space="preserve">	9</w:t>
+      </w:r>
+    </w:p>
+    <w:p>
+      <w:pPr>
+        <w:tabs>
+          <w:tab w:val="right" w:pos="9026" w:leader="dot"/>
+        </w:tabs>
+        <w:spacing w:after="40" w:before="0"/>
+        <w:ind w:left="360"/>
+      </w:pPr>
+      <w:r>
+        <w:rPr>
+          <w:rFonts w:ascii="Arial" w:cs="Arial" w:eastAsia="Arial" w:hAnsi="Arial"/>
+          <w:b w:val="false"/>
+          <w:bCs w:val="false"/>
+          <w:sz w:val="20"/>
+          <w:szCs w:val="20"/>
+        </w:rPr>
+        <w:t xml:space="preserve">7.2 Motores de almacenamiento y modelo medallion</w:t>
+      </w:r>
+      <w:r>
+        <w:rPr>
+          <w:rFonts w:ascii="Arial" w:cs="Arial" w:eastAsia="Arial" w:hAnsi="Arial"/>
+          <w:b w:val="false"/>
+          <w:bCs w:val="false"/>
+          <w:sz w:val="20"/>
+          <w:szCs w:val="20"/>
+        </w:rPr>
+        <w:t xml:space="preserve">	9</w:t>
+      </w:r>
+    </w:p>
+    <w:p>
+      <w:pPr>
+        <w:tabs>
+          <w:tab w:val="right" w:pos="9026" w:leader="dot"/>
+        </w:tabs>
+        <w:spacing w:after="40" w:before="0"/>
+        <w:ind w:left="360"/>
+      </w:pPr>
+      <w:r>
+        <w:rPr>
+          <w:rFonts w:ascii="Arial" w:cs="Arial" w:eastAsia="Arial" w:hAnsi="Arial"/>
+          <w:b w:val="false"/>
+          <w:bCs w:val="false"/>
+          <w:sz w:val="20"/>
+          <w:szCs w:val="20"/>
+        </w:rPr>
+        <w:t xml:space="preserve">7.3 Implementado para esta entrega</w:t>
+      </w:r>
+      <w:r>
+        <w:rPr>
+          <w:rFonts w:ascii="Arial" w:cs="Arial" w:eastAsia="Arial" w:hAnsi="Arial"/>
+          <w:b w:val="false"/>
+          <w:bCs w:val="false"/>
+          <w:sz w:val="20"/>
+          <w:szCs w:val="20"/>
+        </w:rPr>
+        <w:t xml:space="preserve">	10</w:t>
+      </w:r>
+    </w:p>
+    <w:p>
+      <w:pPr>
+        <w:tabs>
+          <w:tab w:val="right" w:pos="9026" w:leader="dot"/>
+        </w:tabs>
+        <w:spacing w:after="40" w:before="100"/>
+        <w:ind w:left="0"/>
+      </w:pPr>
+      <w:r>
+        <w:rPr>
+          <w:rFonts w:ascii="Arial" w:cs="Arial" w:eastAsia="Arial" w:hAnsi="Arial"/>
+          <w:b/>
+          <w:bCs/>
+          <w:sz w:val="21"/>
+          <w:szCs w:val="21"/>
+        </w:rPr>
+        <w:t xml:space="preserve">8. Escalabilidad y performance</w:t>
+      </w:r>
+      <w:r>
+        <w:rPr>
+          <w:rFonts w:ascii="Arial" w:cs="Arial" w:eastAsia="Arial" w:hAnsi="Arial"/>
+          <w:b/>
+          <w:bCs/>
+          <w:sz w:val="21"/>
+          <w:szCs w:val="21"/>
+        </w:rPr>
+        <w:t xml:space="preserve">	10</w:t>
+      </w:r>
+    </w:p>
+    <w:p>
+      <w:pPr>
+        <w:tabs>
+          <w:tab w:val="right" w:pos="9026" w:leader="dot"/>
+        </w:tabs>
+        <w:spacing w:after="40" w:before="0"/>
+        <w:ind w:left="360"/>
+      </w:pPr>
+      <w:r>
+        <w:rPr>
+          <w:rFonts w:ascii="Arial" w:cs="Arial" w:eastAsia="Arial" w:hAnsi="Arial"/>
+          <w:b w:val="false"/>
+          <w:bCs w:val="false"/>
+          <w:sz w:val="20"/>
+          <w:szCs w:val="20"/>
+        </w:rPr>
+        <w:t xml:space="preserve">8.1 Degradación controlada</w:t>
+      </w:r>
+      <w:r>
+        <w:rPr>
+          <w:rFonts w:ascii="Arial" w:cs="Arial" w:eastAsia="Arial" w:hAnsi="Arial"/>
+          <w:b w:val="false"/>
+          <w:bCs w:val="false"/>
+          <w:sz w:val="20"/>
+          <w:szCs w:val="20"/>
+        </w:rPr>
+        <w:t xml:space="preserve">	11</w:t>
+      </w:r>
+    </w:p>
+    <w:p>
+      <w:pPr>
+        <w:tabs>
+          <w:tab w:val="right" w:pos="9026" w:leader="dot"/>
+        </w:tabs>
+        <w:spacing w:after="40" w:before="0"/>
+        <w:ind w:left="360"/>
+      </w:pPr>
+      <w:r>
+        <w:rPr>
+          <w:rFonts w:ascii="Arial" w:cs="Arial" w:eastAsia="Arial" w:hAnsi="Arial"/>
+          <w:b w:val="false"/>
+          <w:bCs w:val="false"/>
+          <w:sz w:val="20"/>
+          <w:szCs w:val="20"/>
+        </w:rPr>
+        <w:t xml:space="preserve">8.2 Metas de performance</w:t>
+      </w:r>
+      <w:r>
+        <w:rPr>
+          <w:rFonts w:ascii="Arial" w:cs="Arial" w:eastAsia="Arial" w:hAnsi="Arial"/>
+          <w:b w:val="false"/>
+          <w:bCs w:val="false"/>
+          <w:sz w:val="20"/>
+          <w:szCs w:val="20"/>
+        </w:rPr>
+        <w:t xml:space="preserve">	11</w:t>
+      </w:r>
+    </w:p>
+    <w:p>
+      <w:pPr>
+        <w:tabs>
+          <w:tab w:val="right" w:pos="9026" w:leader="dot"/>
+        </w:tabs>
+        <w:spacing w:after="40" w:before="100"/>
+        <w:ind w:left="0"/>
+      </w:pPr>
+      <w:r>
+        <w:rPr>
+          <w:rFonts w:ascii="Arial" w:cs="Arial" w:eastAsia="Arial" w:hAnsi="Arial"/>
+          <w:b/>
+          <w:bCs/>
+          <w:sz w:val="21"/>
+          <w:szCs w:val="21"/>
+        </w:rPr>
+        <w:t xml:space="preserve">9. Justificación económica y optimización de costos</w:t>
+      </w:r>
+      <w:r>
+        <w:rPr>
+          <w:rFonts w:ascii="Arial" w:cs="Arial" w:eastAsia="Arial" w:hAnsi="Arial"/>
+          <w:b/>
+          <w:bCs/>
+          <w:sz w:val="21"/>
+          <w:szCs w:val="21"/>
+        </w:rPr>
+        <w:t xml:space="preserve">	11</w:t>
+      </w:r>
+    </w:p>
+    <w:p>
+      <w:pPr>
+        <w:tabs>
+          <w:tab w:val="right" w:pos="9026" w:leader="dot"/>
+        </w:tabs>
+        <w:spacing w:after="40" w:before="0"/>
+        <w:ind w:left="360"/>
+      </w:pPr>
+      <w:r>
+        <w:rPr>
+          <w:rFonts w:ascii="Arial" w:cs="Arial" w:eastAsia="Arial" w:hAnsi="Arial"/>
+          <w:b w:val="false"/>
+          <w:bCs w:val="false"/>
+          <w:sz w:val="20"/>
+          <w:szCs w:val="20"/>
+        </w:rPr>
+        <w:t xml:space="preserve">9.1 Escenarios</w:t>
+      </w:r>
+      <w:r>
+        <w:rPr>
+          <w:rFonts w:ascii="Arial" w:cs="Arial" w:eastAsia="Arial" w:hAnsi="Arial"/>
+          <w:b w:val="false"/>
+          <w:bCs w:val="false"/>
+          <w:sz w:val="20"/>
+          <w:szCs w:val="20"/>
+        </w:rPr>
+        <w:t xml:space="preserve">	11</w:t>
+      </w:r>
+    </w:p>
+    <w:p>
+      <w:pPr>
+        <w:tabs>
+          <w:tab w:val="right" w:pos="9026" w:leader="dot"/>
+        </w:tabs>
+        <w:spacing w:after="40" w:before="0"/>
+        <w:ind w:left="360"/>
+      </w:pPr>
+      <w:r>
+        <w:rPr>
+          <w:rFonts w:ascii="Arial" w:cs="Arial" w:eastAsia="Arial" w:hAnsi="Arial"/>
+          <w:b w:val="false"/>
+          <w:bCs w:val="false"/>
+          <w:sz w:val="20"/>
+          <w:szCs w:val="20"/>
+        </w:rPr>
+        <w:t xml:space="preserve">9.2 Palancas de optimización aplicadas</w:t>
+      </w:r>
+      <w:r>
+        <w:rPr>
+          <w:rFonts w:ascii="Arial" w:cs="Arial" w:eastAsia="Arial" w:hAnsi="Arial"/>
+          <w:b w:val="false"/>
+          <w:bCs w:val="false"/>
+          <w:sz w:val="20"/>
+          <w:szCs w:val="20"/>
+        </w:rPr>
+        <w:t xml:space="preserve">	12</w:t>
+      </w:r>
+    </w:p>
+    <w:p>
+      <w:pPr>
+        <w:tabs>
+          <w:tab w:val="right" w:pos="9026" w:leader="dot"/>
+        </w:tabs>
+        <w:spacing w:after="40" w:before="0"/>
+        <w:ind w:left="360"/>
+      </w:pPr>
+      <w:r>
+        <w:rPr>
+          <w:rFonts w:ascii="Arial" w:cs="Arial" w:eastAsia="Arial" w:hAnsi="Arial"/>
+          <w:b w:val="false"/>
+          <w:bCs w:val="false"/>
+          <w:sz w:val="20"/>
+          <w:szCs w:val="20"/>
+        </w:rPr>
+        <w:t xml:space="preserve">9.3 Automatización de costos</w:t>
+      </w:r>
+      <w:r>
+        <w:rPr>
+          <w:rFonts w:ascii="Arial" w:cs="Arial" w:eastAsia="Arial" w:hAnsi="Arial"/>
+          <w:b w:val="false"/>
+          <w:bCs w:val="false"/>
+          <w:sz w:val="20"/>
+          <w:szCs w:val="20"/>
+        </w:rPr>
+        <w:t xml:space="preserve">	12</w:t>
+      </w:r>
+    </w:p>
+    <w:p>
+      <w:pPr>
+        <w:tabs>
+          <w:tab w:val="right" w:pos="9026" w:leader="dot"/>
+        </w:tabs>
+        <w:spacing w:after="40" w:before="100"/>
+        <w:ind w:left="0"/>
+      </w:pPr>
+      <w:r>
+        <w:rPr>
+          <w:rFonts w:ascii="Arial" w:cs="Arial" w:eastAsia="Arial" w:hAnsi="Arial"/>
+          <w:b/>
+          <w:bCs/>
+          <w:sz w:val="21"/>
+          <w:szCs w:val="21"/>
+        </w:rPr>
+        <w:t xml:space="preserve">10. Plan de recuperación y alta disponibilidad (DRP/HA)</w:t>
+      </w:r>
+      <w:r>
+        <w:rPr>
+          <w:rFonts w:ascii="Arial" w:cs="Arial" w:eastAsia="Arial" w:hAnsi="Arial"/>
+          <w:b/>
+          <w:bCs/>
+          <w:sz w:val="21"/>
+          <w:szCs w:val="21"/>
+        </w:rPr>
+        <w:t xml:space="preserve">	12</w:t>
+      </w:r>
+    </w:p>
+    <w:p>
+      <w:pPr>
+        <w:tabs>
+          <w:tab w:val="right" w:pos="9026" w:leader="dot"/>
+        </w:tabs>
+        <w:spacing w:after="40" w:before="0"/>
+        <w:ind w:left="360"/>
+      </w:pPr>
+      <w:r>
+        <w:rPr>
+          <w:rFonts w:ascii="Arial" w:cs="Arial" w:eastAsia="Arial" w:hAnsi="Arial"/>
+          <w:b w:val="false"/>
+          <w:bCs w:val="false"/>
+          <w:sz w:val="20"/>
+          <w:szCs w:val="20"/>
+        </w:rPr>
+        <w:t xml:space="preserve">10.1 Prototipo frente a producción</w:t>
+      </w:r>
+      <w:r>
+        <w:rPr>
+          <w:rFonts w:ascii="Arial" w:cs="Arial" w:eastAsia="Arial" w:hAnsi="Arial"/>
+          <w:b w:val="false"/>
+          <w:bCs w:val="false"/>
+          <w:sz w:val="20"/>
+          <w:szCs w:val="20"/>
+        </w:rPr>
+        <w:t xml:space="preserve">	13</w:t>
+      </w:r>
+    </w:p>
+    <w:p>
+      <w:pPr>
+        <w:tabs>
+          <w:tab w:val="right" w:pos="9026" w:leader="dot"/>
+        </w:tabs>
+        <w:spacing w:after="40" w:before="100"/>
+        <w:ind w:left="0"/>
+      </w:pPr>
+      <w:r>
+        <w:rPr>
+          <w:rFonts w:ascii="Arial" w:cs="Arial" w:eastAsia="Arial" w:hAnsi="Arial"/>
+          <w:b/>
+          <w:bCs/>
+          <w:sz w:val="21"/>
+          <w:szCs w:val="21"/>
+        </w:rPr>
+        <w:t xml:space="preserve">11. KPIs de éxito y performance</w:t>
+      </w:r>
+      <w:r>
+        <w:rPr>
+          <w:rFonts w:ascii="Arial" w:cs="Arial" w:eastAsia="Arial" w:hAnsi="Arial"/>
+          <w:b/>
+          <w:bCs/>
+          <w:sz w:val="21"/>
+          <w:szCs w:val="21"/>
+        </w:rPr>
+        <w:t xml:space="preserve">	13</w:t>
+      </w:r>
+    </w:p>
+    <w:p>
+      <w:pPr>
+        <w:tabs>
+          <w:tab w:val="right" w:pos="9026" w:leader="dot"/>
+        </w:tabs>
+        <w:spacing w:after="40" w:before="100"/>
+        <w:ind w:left="0"/>
+      </w:pPr>
+      <w:r>
+        <w:rPr>
+          <w:rFonts w:ascii="Arial" w:cs="Arial" w:eastAsia="Arial" w:hAnsi="Arial"/>
+          <w:b/>
+          <w:bCs/>
+          <w:sz w:val="21"/>
+          <w:szCs w:val="21"/>
+        </w:rPr>
+        <w:t xml:space="preserve">12. Seguridad y gobierno</w:t>
+      </w:r>
+      <w:r>
+        <w:rPr>
+          <w:rFonts w:ascii="Arial" w:cs="Arial" w:eastAsia="Arial" w:hAnsi="Arial"/>
+          <w:b/>
+          <w:bCs/>
+          <w:sz w:val="21"/>
+          <w:szCs w:val="21"/>
+        </w:rPr>
+        <w:t xml:space="preserve">	14</w:t>
+      </w:r>
+    </w:p>
+    <w:p>
+      <w:pPr>
+        <w:tabs>
+          <w:tab w:val="right" w:pos="9026" w:leader="dot"/>
+        </w:tabs>
+        <w:spacing w:after="40" w:before="100"/>
+        <w:ind w:left="0"/>
+      </w:pPr>
+      <w:r>
+        <w:rPr>
+          <w:rFonts w:ascii="Arial" w:cs="Arial" w:eastAsia="Arial" w:hAnsi="Arial"/>
+          <w:b/>
+          <w:bCs/>
+          <w:sz w:val="21"/>
+          <w:szCs w:val="21"/>
+        </w:rPr>
+        <w:t xml:space="preserve">13. Plan de trabajo por entregas</w:t>
+      </w:r>
+      <w:r>
+        <w:rPr>
+          <w:rFonts w:ascii="Arial" w:cs="Arial" w:eastAsia="Arial" w:hAnsi="Arial"/>
+          <w:b/>
+          <w:bCs/>
+          <w:sz w:val="21"/>
+          <w:szCs w:val="21"/>
+        </w:rPr>
+        <w:t xml:space="preserve">	14</w:t>
+      </w:r>
+    </w:p>
+    <w:p>
+      <w:pPr>
+        <w:tabs>
+          <w:tab w:val="right" w:pos="9026" w:leader="dot"/>
+        </w:tabs>
+        <w:spacing w:after="40" w:before="100"/>
+        <w:ind w:left="0"/>
+      </w:pPr>
+      <w:r>
+        <w:rPr>
+          <w:rFonts w:ascii="Arial" w:cs="Arial" w:eastAsia="Arial" w:hAnsi="Arial"/>
+          <w:b/>
+          <w:bCs/>
+          <w:sz w:val="21"/>
+          <w:szCs w:val="21"/>
+        </w:rPr>
+        <w:t xml:space="preserve">14. Riesgos y mitigaciones</w:t>
+      </w:r>
+      <w:r>
+        <w:rPr>
+          <w:rFonts w:ascii="Arial" w:cs="Arial" w:eastAsia="Arial" w:hAnsi="Arial"/>
+          <w:b/>
+          <w:bCs/>
+          <w:sz w:val="21"/>
+          <w:szCs w:val="21"/>
+        </w:rPr>
+        <w:t xml:space="preserve">	14</w:t>
+      </w:r>
+    </w:p>
+    <w:p>
+      <w:pPr>
+        <w:tabs>
+          <w:tab w:val="right" w:pos="9026" w:leader="dot"/>
+        </w:tabs>
+        <w:spacing w:after="40" w:before="100"/>
+        <w:ind w:left="0"/>
+      </w:pPr>
+      <w:r>
+        <w:rPr>
+          <w:rFonts w:ascii="Arial" w:cs="Arial" w:eastAsia="Arial" w:hAnsi="Arial"/>
+          <w:b/>
+          <w:bCs/>
+          <w:sz w:val="21"/>
+          <w:szCs w:val="21"/>
+        </w:rPr>
+        <w:t xml:space="preserve">Anexo A. Repositorio y reproducibilidad</w:t>
+      </w:r>
+      <w:r>
+        <w:rPr>
+          <w:rFonts w:ascii="Arial" w:cs="Arial" w:eastAsia="Arial" w:hAnsi="Arial"/>
+          <w:b/>
+          <w:bCs/>
+          <w:sz w:val="21"/>
+          <w:szCs w:val="21"/>
+        </w:rPr>
+        <w:t xml:space="preserve">	14</w:t>
+      </w:r>
+    </w:p>
+    <w:p>
+      <w:pPr>
+        <w:tabs>
+          <w:tab w:val="right" w:pos="9026" w:leader="dot"/>
+        </w:tabs>
+        <w:spacing w:after="40" w:before="100"/>
+        <w:ind w:left="0"/>
+      </w:pPr>
+      <w:r>
+        <w:rPr>
+          <w:rFonts w:ascii="Arial" w:cs="Arial" w:eastAsia="Arial" w:hAnsi="Arial"/>
+          <w:b/>
+          <w:bCs/>
+          <w:sz w:val="21"/>
+          <w:szCs w:val="21"/>
+        </w:rPr>
+        <w:t xml:space="preserve">Referencias</w:t>
+      </w:r>
+      <w:r>
+        <w:rPr>
+          <w:rFonts w:ascii="Arial" w:cs="Arial" w:eastAsia="Arial" w:hAnsi="Arial"/>
+          <w:b/>
+          <w:bCs/>
+          <w:sz w:val="21"/>
+          <w:szCs w:val="21"/>
+        </w:rPr>
+        <w:t xml:space="preserve">	15</w:t>
+      </w:r>
+    </w:p>
+    <w:p>
       <w:r>
         <w:br w:type="page"/>
       </w:r>
@@ -2232,7 +2232,7 @@
         <w:rPr>
           <w:rFonts w:ascii="Arial" w:cs="Arial" w:eastAsia="Arial" w:hAnsi="Arial"/>
         </w:rPr>
-        <w:t xml:space="preserve">La arquitectura sigue el patrón lakehouse medallion. Cloud Storage guarda los datos originales intactos (Bronze) y sus versiones limpias en Parquet (Silver/Gold); BigQuery actúa como data warehouse; Pub/Sub y Dataflow procesan eventos en tiempo real; Cloud Run expone la API y la web; Cloud SQL mantiene el estado transaccional del carrito y los pedidos; y Vertex AI Gemini 2.5 Flash-Lite impulsa el asistente. Todo se declara con Terraform y se despliega desde GitHub.</w:t>
+        <w:t xml:space="preserve">La arquitectura sigue el patrón lakehouse medallion. Cloud Storage guarda los datos originales intactos (Bronze) y sus versiones limpias en Parquet (Silver/Gold); BigQuery actúa como data warehouse; Pub/Sub y Dataflow procesan eventos en tiempo real; Cloud Run expone la API y la web; Cloud SQL mantiene el estado transaccional del carrito y los pedidos; y Vertex AI Gemini 3.1 Flash-Lite impulsa el asistente. Todo se declara con Terraform y se despliega desde GitHub.</w:t>
       </w:r>
     </w:p>
     <w:tbl>
@@ -2297,7 +2297,7 @@
                 <w:sz w:val="20"/>
                 <w:szCs w:val="20"/>
               </w:rPr>
-              <w:t xml:space="preserve">Costo estimado de producción a escala H&amp;M: USD 281.83 al mes, equivalente a USD 0.00075 por pedido procesado. Año 1 (11 meses normales + 1 mes pico Black Friday): USD 4,058. Costo de desarrollo y demo del curso: USD 16.92. Todos los componentes de cómputo son serverless o autoescalables, por lo que el costo crece con la demanda y no con la capacidad reservada.</w:t>
+              <w:t xml:space="preserve">Costo estimado de producción a escala H&amp;M: USD 370.83 al mes, equivalente a USD 0.00098 por pedido procesado. Año 1 (11 meses normales + 1 mes pico Black Friday): USD 5,482. Costo de desarrollo y demo del curso: USD 19.77. Todos los componentes de cómputo son serverless o autoescalables, por lo que el costo crece con la demanda y no con la capacidad reservada.</w:t>
             </w:r>
           </w:p>
         </w:tc>
@@ -6695,7 +6695,7 @@
                 <w:sz w:val="18"/>
                 <w:szCs w:val="18"/>
               </w:rPr>
-              <w:t xml:space="preserve">Vertex AI Gemini 2.5 Flash-Lite</w:t>
+              <w:t xml:space="preserve">Vertex AI Gemini 3.1 Flash-Lite</w:t>
             </w:r>
           </w:p>
         </w:tc>
@@ -6730,7 +6730,7 @@
                 <w:sz w:val="18"/>
                 <w:szCs w:val="18"/>
               </w:rPr>
-              <w:t xml:space="preserve">Modelo más económico de Gemini (USD 0.10/0.40 por millón de tokens), function calling</w:t>
+              <w:t xml:space="preserve">Gemini más económico vigente en Vertex AI (USD 0.25/1.50 por millón de tokens); salida estructurada</w:t>
             </w:r>
           </w:p>
         </w:tc>
@@ -7138,7 +7138,7 @@
                 <w:sz w:val="20"/>
                 <w:szCs w:val="20"/>
               </w:rPr>
-              <w:t xml:space="preserve">Gemini en Vertex AI no es gratuito, pero su costo es marginal: una conversación típica (≈3,000 tokens de entrada y 400 de salida) cuesta alrededor de USD 0.0005. Mil conversaciones de prueba cuestan menos de USD 1, y los créditos de bienvenida de GCP (USD 300 para cuentas nuevas) cubren holgadamente el proyecto. Se limita además con cuotas por minuto y con el presupuesto con alertas descrito en §9.3.</w:t>
+              <w:t xml:space="preserve">Gemini en Vertex AI no es gratuito, pero su costo es marginal: una conversación típica (≈3,000 tokens de entrada y 400 de salida) cuesta alrededor de USD 0.0014. Mil conversaciones de prueba cuestan unos USD 1.40, y los créditos de bienvenida de GCP (USD 300 para cuentas nuevas) cubren holgadamente el proyecto. Se limita además con cuotas por minuto y con el presupuesto con alertas descrito en §9.3.</w:t>
             </w:r>
           </w:p>
         </w:tc>
@@ -12631,7 +12631,7 @@
                 <w:sz w:val="18"/>
                 <w:szCs w:val="18"/>
               </w:rPr>
-              <w:t xml:space="preserve">USD 0.50</w:t>
+              <w:t xml:space="preserve">USD 1.50</w:t>
             </w:r>
           </w:p>
         </w:tc>
@@ -12666,7 +12666,7 @@
                 <w:sz w:val="18"/>
                 <w:szCs w:val="18"/>
               </w:rPr>
-              <w:t xml:space="preserve">USD 0.90</w:t>
+              <w:t xml:space="preserve">USD 2.75</w:t>
             </w:r>
           </w:p>
         </w:tc>
@@ -12701,7 +12701,7 @@
                 <w:sz w:val="18"/>
                 <w:szCs w:val="18"/>
               </w:rPr>
-              <w:t xml:space="preserve">USD 46.00</w:t>
+              <w:t xml:space="preserve">USD 135.00</w:t>
             </w:r>
           </w:p>
         </w:tc>
@@ -12736,7 +12736,7 @@
                 <w:sz w:val="18"/>
                 <w:szCs w:val="18"/>
               </w:rPr>
-              <w:t xml:space="preserve">USD 230.00</w:t>
+              <w:t xml:space="preserve">USD 675.00</w:t>
             </w:r>
           </w:p>
         </w:tc>
@@ -12988,7 +12988,7 @@
                 <w:sz w:val="18"/>
                 <w:szCs w:val="18"/>
               </w:rPr>
-              <w:t xml:space="preserve">USD 7.20</w:t>
+              <w:t xml:space="preserve">USD 8.20</w:t>
             </w:r>
           </w:p>
         </w:tc>
@@ -13023,7 +13023,7 @@
                 <w:sz w:val="18"/>
                 <w:szCs w:val="18"/>
               </w:rPr>
-              <w:t xml:space="preserve">USD 9.72</w:t>
+              <w:t xml:space="preserve">USD 11.57</w:t>
             </w:r>
           </w:p>
         </w:tc>
@@ -13058,7 +13058,7 @@
                 <w:sz w:val="18"/>
                 <w:szCs w:val="18"/>
               </w:rPr>
-              <w:t xml:space="preserve">USD 281.83</w:t>
+              <w:t xml:space="preserve">USD 370.83</w:t>
             </w:r>
           </w:p>
         </w:tc>
@@ -13093,7 +13093,7 @@
                 <w:sz w:val="18"/>
                 <w:szCs w:val="18"/>
               </w:rPr>
-              <w:t xml:space="preserve">USD 958.21</w:t>
+              <w:t xml:space="preserve">USD 1,403.21</w:t>
             </w:r>
           </w:p>
         </w:tc>
@@ -13345,7 +13345,7 @@
                 <w:sz w:val="18"/>
                 <w:szCs w:val="18"/>
               </w:rPr>
-              <w:t xml:space="preserve">USD 0.00144</w:t>
+              <w:t xml:space="preserve">USD 0.00164</w:t>
             </w:r>
           </w:p>
         </w:tc>
@@ -13380,7 +13380,7 @@
                 <w:sz w:val="18"/>
                 <w:szCs w:val="18"/>
               </w:rPr>
-              <w:t xml:space="preserve">USD 0.00049</w:t>
+              <w:t xml:space="preserve">USD 0.00058</w:t>
             </w:r>
           </w:p>
         </w:tc>
@@ -13415,7 +13415,7 @@
                 <w:sz w:val="18"/>
                 <w:szCs w:val="18"/>
               </w:rPr>
-              <w:t xml:space="preserve">USD 0.00075</w:t>
+              <w:t xml:space="preserve">USD 0.00098</w:t>
             </w:r>
           </w:p>
         </w:tc>
@@ -13450,7 +13450,7 @@
                 <w:sz w:val="18"/>
                 <w:szCs w:val="18"/>
               </w:rPr>
-              <w:t xml:space="preserve">USD 0.00051</w:t>
+              <w:t xml:space="preserve">USD 0.00074</w:t>
             </w:r>
           </w:p>
         </w:tc>
@@ -13535,7 +13535,7 @@
                 <w:sz w:val="20"/>
                 <w:szCs w:val="20"/>
               </w:rPr>
-              <w:t xml:space="preserve">En producción la plataforma cuesta USD 0.00075 por pedido (menos de una décima de centavo). En el pico de Black Friday baja a USD 0.00051, porque los costos fijos (Cloud SQL, almacenamiento) se reparten entre más pedidos y el resto escala con el uso. El año 1 completo se estima en USD 4,058.</w:t>
+              <w:t xml:space="preserve">En producción la plataforma cuesta USD 0.00098 por pedido (menos de una décima de centavo). En el pico de Black Friday baja a USD 0.00074, porque los costos fijos (Cloud SQL, almacenamiento) se reparten entre más pedidos y el resto escala con el uso. El año 1 completo se estima en USD 5,482.</w:t>
             </w:r>
           </w:p>
         </w:tc>
@@ -13674,7 +13674,7 @@
         <w:rPr>
           <w:rFonts w:ascii="Arial" w:cs="Arial" w:eastAsia="Arial" w:hAnsi="Arial"/>
         </w:rPr>
-        <w:t xml:space="preserve">Gemini 2.5 Flash-Lite y caché de respuestas frecuentes.</w:t>
+        <w:t xml:space="preserve">Gemini 3.1 Flash-Lite (el modelo se cambia desde el Excel de control) y caché de respuestas frecuentes.</w:t>
       </w:r>
     </w:p>
     <w:p>
@@ -13958,7 +13958,7 @@
                 <w:sz w:val="18"/>
                 <w:szCs w:val="18"/>
               </w:rPr>
-              <w:t xml:space="preserve">cost/estimate_costs.py, make cost, make cost-refresh</w:t>
+              <w:t xml:space="preserve">cost/estimate_costs.py (--refresh-prices)</w:t>
             </w:r>
           </w:p>
         </w:tc>
@@ -17222,7 +17222,7 @@
                 <w:sz w:val="18"/>
                 <w:szCs w:val="18"/>
               </w:rPr>
-              <w:t xml:space="preserve">≤ USD 0.0009 (estimado + 20%)</w:t>
+              <w:t xml:space="preserve">≤ USD 0.0012 (estimado + 20%)</w:t>
             </w:r>
           </w:p>
         </w:tc>
@@ -18666,7 +18666,7 @@
           <w:sz w:val="18"/>
           <w:szCs w:val="18"/>
         </w:rPr>
-        <w:t xml:space="preserve">infra/terraform/        Infraestructura GCP (estado remoto en GCS)</w:t>
+        <w:t xml:space="preserve">config/                 Excel de control: parámetros, tablas, columnas, usuarios y permisos</w:t>
       </w:r>
     </w:p>
     <w:p>
@@ -18679,7 +18679,7 @@
           <w:sz w:val="18"/>
           <w:szCs w:val="18"/>
         </w:rPr>
-        <w:t xml:space="preserve">ingestion/batch/        Carga de H&amp;M a Bronze con manifiesto</w:t>
+        <w:t xml:space="preserve">ops.py                  Orquestador de despliegue (Windows, Linux, Cloud Shell)</w:t>
       </w:r>
     </w:p>
     <w:p>
@@ -18692,7 +18692,7 @@
           <w:sz w:val="18"/>
           <w:szCs w:val="18"/>
         </w:rPr>
-        <w:t xml:space="preserve">ingestion/streaming/    Publicador replay de eventos 2026</w:t>
+        <w:t xml:space="preserve">infra/terraform/        Infraestructura GCP (estado remoto en GCS)</w:t>
       </w:r>
     </w:p>
     <w:p>
@@ -18705,7 +18705,59 @@
           <w:sz w:val="18"/>
           <w:szCs w:val="18"/>
         </w:rPr>
-        <w:t xml:space="preserve">sql/bronze/             Tablas Bronze en BigQuery</w:t>
+        <w:t xml:space="preserve">ingestion/batch/        Carga de H&amp;M a Bronze con manifiesto</w:t>
+      </w:r>
+    </w:p>
+    <w:p>
+      <w:pPr>
+        <w:spacing w:after="0"/>
+      </w:pPr>
+      <w:r>
+        <w:rPr>
+          <w:rFonts w:ascii="Consolas" w:cs="Consolas" w:eastAsia="Consolas" w:hAnsi="Consolas"/>
+          <w:sz w:val="18"/>
+          <w:szCs w:val="18"/>
+        </w:rPr>
+        <w:t xml:space="preserve">ingestion/streaming/    Publicador replay de eventos 2026</w:t>
+      </w:r>
+    </w:p>
+    <w:p>
+      <w:pPr>
+        <w:spacing w:after="0"/>
+      </w:pPr>
+      <w:r>
+        <w:rPr>
+          <w:rFonts w:ascii="Consolas" w:cs="Consolas" w:eastAsia="Consolas" w:hAnsi="Consolas"/>
+          <w:sz w:val="18"/>
+          <w:szCs w:val="18"/>
+        </w:rPr>
+        <w:t xml:space="preserve">pipelines/              Spark (Silver), Dataflow (streaming), recomendador</w:t>
+      </w:r>
+    </w:p>
+    <w:p>
+      <w:pPr>
+        <w:spacing w:after="0"/>
+      </w:pPr>
+      <w:r>
+        <w:rPr>
+          <w:rFonts w:ascii="Consolas" w:cs="Consolas" w:eastAsia="Consolas" w:hAnsi="Consolas"/>
+          <w:sz w:val="18"/>
+          <w:szCs w:val="18"/>
+        </w:rPr>
+        <w:t xml:space="preserve">sql/                    Bronze, Silver, Gold y vistas BI en BigQuery</w:t>
+      </w:r>
+    </w:p>
+    <w:p>
+      <w:pPr>
+        <w:spacing w:after="0"/>
+      </w:pPr>
+      <w:r>
+        <w:rPr>
+          <w:rFonts w:ascii="Consolas" w:cs="Consolas" w:eastAsia="Consolas" w:hAnsi="Consolas"/>
+          <w:sz w:val="18"/>
+          <w:szCs w:val="18"/>
+        </w:rPr>
+        <w:t xml:space="preserve">api/                    FastAPI, web, asistente Gemini y wallet</w:t>
       </w:r>
     </w:p>
     <w:p>
@@ -18813,7 +18865,19 @@
         <w:rPr>
           <w:rFonts w:ascii="Arial" w:cs="Arial" w:eastAsia="Arial" w:hAnsi="Arial"/>
         </w:rPr>
-        <w:t xml:space="preserve">Comandos principales: make setup · make cost · make manifest · make tf-bootstrap · make tf-init · make tf-plan · make ingest-raw · make bq-bronze · make replay-dry · make test.</w:t>
+        <w:t xml:space="preserve">Todos los nombres, parámetros, tablas, columnas, usuarios iniciales y permisos se controlan desde config/control_plataforma.xlsx; python ops.py config los convierte en variables de Terraform y semillas de la API, y python ops.py verificar compara lo desplegado contra el Excel.</w:t>
+      </w:r>
+    </w:p>
+    <w:p>
+      <w:pPr>
+        <w:spacing w:after="120" w:line="276"/>
+        <w:jc w:val="both"/>
+      </w:pPr>
+      <w:r>
+        <w:rPr>
+          <w:rFonts w:ascii="Arial" w:cs="Arial" w:eastAsia="Arial" w:hAnsi="Arial"/>
+        </w:rPr>
+        <w:t xml:space="preserve">Comandos principales: python ops.py config · bootstrap · plan · apply · subir-datos · bronze · silver · gold · api · verificar · todo. Guía completa en docs/DEPLOY.md.</w:t>
       </w:r>
     </w:p>
     <w:p>

</xml_diff>

<commit_message>
Entrega 1 v1.1: nombre STYLUS, JSON de control y repositorio real
- Documento de Entrega 1 (Word + PDF) con portada STYLUS, versión 1.1,
  repositorio github.com/estuardoo/STYLUS y proyecto GCP real
- Referencias al Excel de control reemplazadas por
  config/control_plataforma.json + panel web; cuatro cuentas de servicio
- Anexo A apunta a la guía técnica completa

Co-Authored-By: Claude Opus 5.5 <noreply@anthropic.com>
Claude-Session: https://claude.ai/code/session_01MgiFcvhexL3jkhqY5yJgLS
</commit_message>
<xml_diff>
--- a/docs/entrega1/Entrega1_Arquitectura_BigData_Retail.docx
+++ b/docs/entrega1/Entrega1_Arquitectura_BigData_Retail.docx
@@ -28,7 +28,7 @@
     </w:p>
     <w:p>
       <w:pPr>
-        <w:spacing w:after="200"/>
+        <w:spacing w:after="120"/>
       </w:pPr>
       <w:r>
         <w:rPr>
@@ -36,24 +36,40 @@
           <w:b/>
           <w:bCs/>
           <w:color w:val="1F3864"/>
-          <w:sz w:val="52"/>
-          <w:szCs w:val="52"/>
-        </w:rPr>
-        <w:t xml:space="preserve">Retail Intelligence &amp; Personal Shopping Assistant</w:t>
+          <w:sz w:val="72"/>
+          <w:szCs w:val="72"/>
+        </w:rPr>
+        <w:t xml:space="preserve">STYLUS</w:t>
       </w:r>
     </w:p>
     <w:p>
       <w:pPr>
+        <w:spacing w:after="200"/>
+      </w:pPr>
+      <w:r>
+        <w:rPr>
+          <w:rFonts w:ascii="Arial" w:cs="Arial" w:eastAsia="Arial" w:hAnsi="Arial"/>
+          <w:b/>
+          <w:bCs/>
+          <w:color w:val="2E75B6"/>
+          <w:sz w:val="34"/>
+          <w:szCs w:val="34"/>
+        </w:rPr>
+        <w:t xml:space="preserve">Retail de moda con compras inteligentes asistidas por IA en tiempo real</w:t>
+      </w:r>
+    </w:p>
+    <w:p>
+      <w:pPr>
         <w:spacing w:after="600"/>
       </w:pPr>
       <w:r>
         <w:rPr>
           <w:rFonts w:ascii="Arial" w:cs="Arial" w:eastAsia="Arial" w:hAnsi="Arial"/>
           <w:color w:val="595959"/>
-          <w:sz w:val="26"/>
-          <w:szCs w:val="26"/>
-        </w:rPr>
-        <w:t xml:space="preserve">Plataforma Big Data de retail en Google Cloud: ingesta batch y streaming, lakehouse medallion, analítica, recomendaciones y asistente con Vertex AI Gemini</w:t>
+          <w:sz w:val="24"/>
+          <w:szCs w:val="24"/>
+        </w:rPr>
+        <w:t xml:space="preserve">Plataforma Big Data en Google Cloud sobre el dataset público H&amp;M (Kaggle): ingesta batch y streaming, lakehouse medallion, analítica, recomendaciones y asistente con Vertex AI Gemini</w:t>
       </w:r>
     </w:p>
     <w:p>
@@ -504,7 +520,21 @@
           <w:sz w:val="20"/>
           <w:szCs w:val="20"/>
         </w:rPr>
-        <w:t xml:space="preserve">Fecha de entrega: 24 de octubre de 2026 · Versión 1.0</w:t>
+        <w:t xml:space="preserve">Fecha de entrega: 24 de octubre de 2026 · Versión 1.1</w:t>
+      </w:r>
+    </w:p>
+    <w:p>
+      <w:pPr>
+        <w:spacing w:before="60"/>
+      </w:pPr>
+      <w:r>
+        <w:rPr>
+          <w:rFonts w:ascii="Arial" w:cs="Arial" w:eastAsia="Arial" w:hAnsi="Arial"/>
+          <w:color w:val="595959"/>
+          <w:sz w:val="20"/>
+          <w:szCs w:val="20"/>
+        </w:rPr>
+        <w:t xml:space="preserve">Repositorio: github.com/estuardoo/STYLUS · Proyecto GCP: tranquil-leaf-512618-b9</w:t>
       </w:r>
     </w:p>
     <w:p>
@@ -772,7 +802,7 @@
                 <w:sz w:val="18"/>
                 <w:szCs w:val="18"/>
               </w:rPr>
-              <w:t xml:space="preserve">1.0 (22-oct-2026): primera versión completa para revisión del equipo</w:t>
+              <w:t xml:space="preserve">1.1 (24-oct-2026): nombre STYLUS, configuración en JSON + panel web, repositorio y proyecto GCP reales</w:t>
             </w:r>
           </w:p>
         </w:tc>
@@ -13674,7 +13704,7 @@
         <w:rPr>
           <w:rFonts w:ascii="Arial" w:cs="Arial" w:eastAsia="Arial" w:hAnsi="Arial"/>
         </w:rPr>
-        <w:t xml:space="preserve">Gemini 3.1 Flash-Lite (el modelo se cambia desde el Excel de control) y caché de respuestas frecuentes.</w:t>
+        <w:t xml:space="preserve">Gemini 3.1 Flash-Lite (el modelo se cambia desde config/control_plataforma.json) y caché de respuestas frecuentes.</w:t>
       </w:r>
     </w:p>
     <w:p>
@@ -17320,7 +17350,7 @@
         <w:rPr>
           <w:rFonts w:ascii="Arial" w:cs="Arial" w:eastAsia="Arial" w:hAnsi="Arial"/>
         </w:rPr>
-        <w:t xml:space="preserve">Tres cuentas de servicio con mínimo privilegio (ingesta, pipelines, API); GitHub Actions usa Workload Identity Federation, sin llaves JSON.</w:t>
+        <w:t xml:space="preserve">Cuatro cuentas de servicio con mínimo privilegio (ingesta, pipelines, API y despliegue); GitHub Actions usa Workload Identity Federation, sin llaves JSON.</w:t>
       </w:r>
     </w:p>
     <w:p>
@@ -18653,7 +18683,7 @@
         <w:rPr>
           <w:rFonts w:ascii="Arial" w:cs="Arial" w:eastAsia="Arial" w:hAnsi="Arial"/>
         </w:rPr>
-        <w:t xml:space="preserve">El repositorio se publica en GitHub sin datos ni secretos. Estructura:</w:t>
+        <w:t xml:space="preserve">El repositorio github.com/estuardoo/STYLUS (privado) se publica sin datos ni secretos. Estructura:</w:t>
       </w:r>
     </w:p>
     <w:p>
@@ -18666,7 +18696,7 @@
           <w:sz w:val="18"/>
           <w:szCs w:val="18"/>
         </w:rPr>
-        <w:t xml:space="preserve">config/                 Excel de control: parámetros, tablas, columnas, usuarios y permisos</w:t>
+        <w:t xml:space="preserve">config/                 JSON de control: parámetros, tablas, columnas, usuarios y permisos</w:t>
       </w:r>
     </w:p>
     <w:p>
@@ -18679,7 +18709,7 @@
           <w:sz w:val="18"/>
           <w:szCs w:val="18"/>
         </w:rPr>
-        <w:t xml:space="preserve">ops.py                  Orquestador de despliegue (Windows, Linux, Cloud Shell)</w:t>
+        <w:t xml:space="preserve">panel/                  Panel web local para editar la configuración y desplegar</w:t>
       </w:r>
     </w:p>
     <w:p>
@@ -18692,7 +18722,7 @@
           <w:sz w:val="18"/>
           <w:szCs w:val="18"/>
         </w:rPr>
-        <w:t xml:space="preserve">infra/terraform/        Infraestructura GCP (estado remoto en GCS)</w:t>
+        <w:t xml:space="preserve">ops.py                  Orquestador de despliegue (Windows, Linux, Cloud Shell)</w:t>
       </w:r>
     </w:p>
     <w:p>
@@ -18705,7 +18735,7 @@
           <w:sz w:val="18"/>
           <w:szCs w:val="18"/>
         </w:rPr>
-        <w:t xml:space="preserve">ingestion/batch/        Carga de H&amp;M a Bronze con manifiesto</w:t>
+        <w:t xml:space="preserve">infra/terraform/        Infraestructura GCP (estado remoto en GCS)</w:t>
       </w:r>
     </w:p>
     <w:p>
@@ -18718,7 +18748,7 @@
           <w:sz w:val="18"/>
           <w:szCs w:val="18"/>
         </w:rPr>
-        <w:t xml:space="preserve">ingestion/streaming/    Publicador replay de eventos 2026</w:t>
+        <w:t xml:space="preserve">ingestion/batch/        Carga de H&amp;M a Bronze con manifiesto</w:t>
       </w:r>
     </w:p>
     <w:p>
@@ -18731,7 +18761,7 @@
           <w:sz w:val="18"/>
           <w:szCs w:val="18"/>
         </w:rPr>
-        <w:t xml:space="preserve">pipelines/              Spark (Silver), Dataflow (streaming), recomendador</w:t>
+        <w:t xml:space="preserve">ingestion/streaming/    Publicador replay de eventos 2026</w:t>
       </w:r>
     </w:p>
     <w:p>
@@ -18744,7 +18774,7 @@
           <w:sz w:val="18"/>
           <w:szCs w:val="18"/>
         </w:rPr>
-        <w:t xml:space="preserve">sql/                    Bronze, Silver, Gold y vistas BI en BigQuery</w:t>
+        <w:t xml:space="preserve">pipelines/              Spark (Silver), Dataflow (streaming), recomendador</w:t>
       </w:r>
     </w:p>
     <w:p>
@@ -18757,7 +18787,7 @@
           <w:sz w:val="18"/>
           <w:szCs w:val="18"/>
         </w:rPr>
-        <w:t xml:space="preserve">api/                    FastAPI, web, asistente Gemini y wallet</w:t>
+        <w:t xml:space="preserve">sql/                    Bronze, Silver, Gold y vistas BI en BigQuery</w:t>
       </w:r>
     </w:p>
     <w:p>
@@ -18770,7 +18800,7 @@
           <w:sz w:val="18"/>
           <w:szCs w:val="18"/>
         </w:rPr>
-        <w:t xml:space="preserve">cost/                   Calculadora y automatización de costos</w:t>
+        <w:t xml:space="preserve">api/                    FastAPI, web, asistente Gemini y wallet</w:t>
       </w:r>
     </w:p>
     <w:p>
@@ -18783,7 +18813,7 @@
           <w:sz w:val="18"/>
           <w:szCs w:val="18"/>
         </w:rPr>
-        <w:t xml:space="preserve">docs/architecture/      Diagramas regenerables (Graphviz)</w:t>
+        <w:t xml:space="preserve">cost/                   Calculadora y automatización de costos</w:t>
       </w:r>
     </w:p>
     <w:p>
@@ -18796,7 +18826,7 @@
           <w:sz w:val="18"/>
           <w:szCs w:val="18"/>
         </w:rPr>
-        <w:t xml:space="preserve">docs/entrega1/          Este documento</w:t>
+        <w:t xml:space="preserve">docs/architecture/      Diagramas regenerables (Graphviz)</w:t>
       </w:r>
     </w:p>
     <w:p>
@@ -18809,7 +18839,7 @@
           <w:sz w:val="18"/>
           <w:szCs w:val="18"/>
         </w:rPr>
-        <w:t xml:space="preserve">docs/gestion/           Matriz de auditoría y roles</w:t>
+        <w:t xml:space="preserve">docs/entrega1/          Este documento</w:t>
       </w:r>
     </w:p>
     <w:p>
@@ -18822,7 +18852,7 @@
           <w:sz w:val="18"/>
           <w:szCs w:val="18"/>
         </w:rPr>
-        <w:t xml:space="preserve">tests/                  Pruebas unitarias</w:t>
+        <w:t xml:space="preserve">docs/gestion/           Matriz de auditoría y roles</w:t>
       </w:r>
     </w:p>
     <w:p>
@@ -18835,7 +18865,7 @@
           <w:sz w:val="18"/>
           <w:szCs w:val="18"/>
         </w:rPr>
-        <w:t xml:space="preserve">.github/workflows/      CI: pruebas, costos, terraform validate</w:t>
+        <w:t xml:space="preserve">tests/                  Pruebas unitarias</w:t>
       </w:r>
     </w:p>
     <w:p>
@@ -18848,16 +18878,29 @@
           <w:sz w:val="18"/>
           <w:szCs w:val="18"/>
         </w:rPr>
-        <w:t xml:space="preserve">data/                   Solo local; excluido de Git</w:t>
+        <w:t xml:space="preserve">.github/workflows/      CI: pruebas, costos, terraform validate</w:t>
       </w:r>
     </w:p>
     <w:p>
       <w:pPr>
-        <w:spacing w:after="80"/>
-      </w:pPr>
+        <w:spacing w:after="0"/>
+      </w:pPr>
+      <w:r>
+        <w:rPr>
+          <w:rFonts w:ascii="Consolas" w:cs="Consolas" w:eastAsia="Consolas" w:hAnsi="Consolas"/>
+          <w:sz w:val="18"/>
+          <w:szCs w:val="18"/>
+        </w:rPr>
+        <w:t xml:space="preserve">data/                   Solo local; excluido de Git</w:t>
+      </w:r>
     </w:p>
     <w:p>
       <w:pPr>
+        <w:spacing w:after="80"/>
+      </w:pPr>
+    </w:p>
+    <w:p>
+      <w:pPr>
         <w:spacing w:after="120" w:line="276"/>
         <w:jc w:val="both"/>
       </w:pPr>
@@ -18865,7 +18908,7 @@
         <w:rPr>
           <w:rFonts w:ascii="Arial" w:cs="Arial" w:eastAsia="Arial" w:hAnsi="Arial"/>
         </w:rPr>
-        <w:t xml:space="preserve">Todos los nombres, parámetros, tablas, columnas, usuarios iniciales y permisos se controlan desde config/control_plataforma.xlsx; python ops.py config los convierte en variables de Terraform y semillas de la API, y python ops.py verificar compara lo desplegado contra el Excel.</w:t>
+        <w:t xml:space="preserve">Todos los nombres, parámetros, tablas, columnas, usuarios iniciales y permisos se controlan desde config/control_plataforma.json (editable con python ops.py panel); python ops.py config los convierte en variables de Terraform y semillas de la API, y python ops.py verificar compara lo desplegado contra ese archivo.</w:t>
       </w:r>
     </w:p>
     <w:p>
@@ -18877,7 +18920,7 @@
         <w:rPr>
           <w:rFonts w:ascii="Arial" w:cs="Arial" w:eastAsia="Arial" w:hAnsi="Arial"/>
         </w:rPr>
-        <w:t xml:space="preserve">Comandos principales: python ops.py config · bootstrap · plan · apply · subir-datos · bronze · silver · gold · api · verificar · todo. Guía completa en docs/DEPLOY.md.</w:t>
+        <w:t xml:space="preserve">Comandos principales: python ops.py config · bootstrap · plan · apply · subir-datos · bronze · silver · gold · api · verificar · todo. Guía de despliegue en docs/DEPLOY.md y guía técnica completa en docs/entrega1/Guia_Tecnica_STYLUS.pdf.</w:t>
       </w:r>
     </w:p>
     <w:p>
@@ -19228,7 +19271,7 @@
         <w:sz w:val="16"/>
         <w:szCs w:val="16"/>
       </w:rPr>
-      <w:t xml:space="preserve">Retail Intelligence &amp; Personal Shopping Assistant</w:t>
+      <w:t xml:space="preserve">STYLUS · Retail con compras inteligentes asistidas por IA</w:t>
     </w:r>
     <w:r>
       <w:rPr>

</xml_diff>